<commit_message>
Added a pause/freze system when game starts and when lose life/ball reset. Added to my section 10 for doc, also did some slight formatting changes.
</commit_message>
<xml_diff>
--- a/docs/Group3_Phase1_Source_Code_Report_Breakout.docx
+++ b/docs/Group3_Phase1_Source_Code_Report_Breakout.docx
@@ -70,8 +70,6 @@
       </w:r>
       <w:r>
         <w:br/>
-      </w:r>
-      <w:r>
         <w:t>Project Context: Built from the approved Project Plan and Theory/Design documents</w:t>
       </w:r>
       <w:r>
@@ -170,7 +168,7 @@
             <w:vAlign w:val="center"/>
           </w:tcPr>
           <w:p>
-            <w:hyperlink r:id="rId6" w:history="1">
+            <w:hyperlink r:id="rId8" w:history="1">
               <w:r>
                 <w:rPr>
                   <w:rStyle w:val="Hyperlink"/>
@@ -313,7 +311,15 @@
         <w:t xml:space="preserve">. </w:t>
       </w:r>
       <w:r>
-        <w:t>This report reflects the repository state at the time of submission.</w:t>
+        <w:t xml:space="preserve">This report reflects the </w:t>
+      </w:r>
+      <w:proofErr w:type="gramStart"/>
+      <w:r>
+        <w:t>repository state</w:t>
+      </w:r>
+      <w:proofErr w:type="gramEnd"/>
+      <w:r>
+        <w:t xml:space="preserve"> at the time of submission.</w:t>
       </w:r>
     </w:p>
     <w:p>
@@ -368,14 +374,7 @@
                 <w:b/>
                 <w:color w:val="FFFFFF"/>
               </w:rPr>
-              <w:t>O</w:t>
-            </w:r>
-            <w:r>
-              <w:rPr>
-                <w:b/>
-                <w:color w:val="FFFFFF"/>
-              </w:rPr>
-              <w:t>bjective</w:t>
+              <w:t>Objective</w:t>
             </w:r>
           </w:p>
         </w:tc>
@@ -435,6 +434,9 @@
         <w:tc>
           <w:tcPr>
             <w:tcW w:w="3312" w:type="dxa"/>
+            <w:tcBorders>
+              <w:bottom w:val="single" w:sz="4" w:space="0" w:color="auto"/>
+            </w:tcBorders>
             <w:tcMar>
               <w:top w:w="80" w:type="dxa"/>
               <w:left w:w="110" w:type="dxa"/>
@@ -453,6 +455,9 @@
         <w:tc>
           <w:tcPr>
             <w:tcW w:w="3312" w:type="dxa"/>
+            <w:tcBorders>
+              <w:bottom w:val="single" w:sz="4" w:space="0" w:color="auto"/>
+            </w:tcBorders>
             <w:tcMar>
               <w:top w:w="80" w:type="dxa"/>
               <w:left w:w="110" w:type="dxa"/>
@@ -478,6 +483,9 @@
         <w:tc>
           <w:tcPr>
             <w:tcW w:w="3312" w:type="dxa"/>
+            <w:tcBorders>
+              <w:bottom w:val="single" w:sz="4" w:space="0" w:color="auto"/>
+            </w:tcBorders>
             <w:tcMar>
               <w:top w:w="80" w:type="dxa"/>
               <w:left w:w="110" w:type="dxa"/>
@@ -503,6 +511,10 @@
         <w:tc>
           <w:tcPr>
             <w:tcW w:w="3312" w:type="dxa"/>
+            <w:tcBorders>
+              <w:top w:val="single" w:sz="4" w:space="0" w:color="auto"/>
+              <w:bottom w:val="single" w:sz="4" w:space="0" w:color="auto"/>
+            </w:tcBorders>
             <w:tcMar>
               <w:top w:w="80" w:type="dxa"/>
               <w:left w:w="110" w:type="dxa"/>
@@ -520,6 +532,10 @@
         <w:tc>
           <w:tcPr>
             <w:tcW w:w="3312" w:type="dxa"/>
+            <w:tcBorders>
+              <w:top w:val="single" w:sz="4" w:space="0" w:color="auto"/>
+              <w:bottom w:val="single" w:sz="4" w:space="0" w:color="auto"/>
+            </w:tcBorders>
             <w:tcMar>
               <w:top w:w="80" w:type="dxa"/>
               <w:left w:w="110" w:type="dxa"/>
@@ -537,6 +553,10 @@
         <w:tc>
           <w:tcPr>
             <w:tcW w:w="3312" w:type="dxa"/>
+            <w:tcBorders>
+              <w:top w:val="single" w:sz="4" w:space="0" w:color="auto"/>
+              <w:bottom w:val="single" w:sz="4" w:space="0" w:color="auto"/>
+            </w:tcBorders>
             <w:tcMar>
               <w:top w:w="80" w:type="dxa"/>
               <w:left w:w="110" w:type="dxa"/>
@@ -562,6 +582,10 @@
         <w:tc>
           <w:tcPr>
             <w:tcW w:w="3312" w:type="dxa"/>
+            <w:tcBorders>
+              <w:top w:val="single" w:sz="4" w:space="0" w:color="auto"/>
+              <w:bottom w:val="single" w:sz="4" w:space="0" w:color="auto"/>
+            </w:tcBorders>
             <w:tcMar>
               <w:top w:w="80" w:type="dxa"/>
               <w:left w:w="110" w:type="dxa"/>
@@ -579,6 +603,10 @@
         <w:tc>
           <w:tcPr>
             <w:tcW w:w="3312" w:type="dxa"/>
+            <w:tcBorders>
+              <w:top w:val="single" w:sz="4" w:space="0" w:color="auto"/>
+              <w:bottom w:val="single" w:sz="4" w:space="0" w:color="auto"/>
+            </w:tcBorders>
             <w:tcMar>
               <w:top w:w="80" w:type="dxa"/>
               <w:left w:w="110" w:type="dxa"/>
@@ -596,6 +624,10 @@
         <w:tc>
           <w:tcPr>
             <w:tcW w:w="3312" w:type="dxa"/>
+            <w:tcBorders>
+              <w:top w:val="single" w:sz="4" w:space="0" w:color="auto"/>
+              <w:bottom w:val="single" w:sz="4" w:space="0" w:color="auto"/>
+            </w:tcBorders>
             <w:tcMar>
               <w:top w:w="80" w:type="dxa"/>
               <w:left w:w="110" w:type="dxa"/>
@@ -621,6 +653,10 @@
         <w:tc>
           <w:tcPr>
             <w:tcW w:w="3312" w:type="dxa"/>
+            <w:tcBorders>
+              <w:top w:val="single" w:sz="4" w:space="0" w:color="auto"/>
+              <w:bottom w:val="single" w:sz="4" w:space="0" w:color="auto"/>
+            </w:tcBorders>
             <w:tcMar>
               <w:top w:w="80" w:type="dxa"/>
               <w:left w:w="110" w:type="dxa"/>
@@ -638,6 +674,10 @@
         <w:tc>
           <w:tcPr>
             <w:tcW w:w="3312" w:type="dxa"/>
+            <w:tcBorders>
+              <w:top w:val="single" w:sz="4" w:space="0" w:color="auto"/>
+              <w:bottom w:val="single" w:sz="4" w:space="0" w:color="auto"/>
+            </w:tcBorders>
             <w:tcMar>
               <w:top w:w="80" w:type="dxa"/>
               <w:left w:w="110" w:type="dxa"/>
@@ -655,6 +695,10 @@
         <w:tc>
           <w:tcPr>
             <w:tcW w:w="3312" w:type="dxa"/>
+            <w:tcBorders>
+              <w:top w:val="single" w:sz="4" w:space="0" w:color="auto"/>
+              <w:bottom w:val="single" w:sz="4" w:space="0" w:color="auto"/>
+            </w:tcBorders>
             <w:tcMar>
               <w:top w:w="80" w:type="dxa"/>
               <w:left w:w="110" w:type="dxa"/>
@@ -680,6 +724,10 @@
         <w:tc>
           <w:tcPr>
             <w:tcW w:w="3312" w:type="dxa"/>
+            <w:tcBorders>
+              <w:top w:val="single" w:sz="4" w:space="0" w:color="auto"/>
+              <w:bottom w:val="single" w:sz="4" w:space="0" w:color="auto"/>
+            </w:tcBorders>
             <w:tcMar>
               <w:top w:w="80" w:type="dxa"/>
               <w:left w:w="110" w:type="dxa"/>
@@ -697,6 +745,10 @@
         <w:tc>
           <w:tcPr>
             <w:tcW w:w="3312" w:type="dxa"/>
+            <w:tcBorders>
+              <w:top w:val="single" w:sz="4" w:space="0" w:color="auto"/>
+              <w:bottom w:val="single" w:sz="4" w:space="0" w:color="auto"/>
+            </w:tcBorders>
             <w:tcMar>
               <w:top w:w="80" w:type="dxa"/>
               <w:left w:w="110" w:type="dxa"/>
@@ -714,6 +766,10 @@
         <w:tc>
           <w:tcPr>
             <w:tcW w:w="3312" w:type="dxa"/>
+            <w:tcBorders>
+              <w:top w:val="single" w:sz="4" w:space="0" w:color="auto"/>
+              <w:bottom w:val="single" w:sz="4" w:space="0" w:color="auto"/>
+            </w:tcBorders>
             <w:tcMar>
               <w:top w:w="80" w:type="dxa"/>
               <w:left w:w="110" w:type="dxa"/>
@@ -748,68 +804,20 @@
     </w:p>
     <w:p>
       <w:r>
-        <w:t>Phase I uses a loop-driven architecture centered on a single Game class. The program begins in phase1_main.cpp, which constructs Game and delegates execution to Game::run(). Within the game loop, the system polls events, processes keyboard and mouse input, updates object positions using delta time, evaluates collisions, updates score and lives, checks win or loss state, and renders the frame.</w:t>
+        <w:t xml:space="preserve">Phase I uses a loop-driven architecture centered on a single Game class. The program begins in phase1_main.cpp, which constructs Game and delegates execution to </w:t>
+      </w:r>
+      <w:proofErr w:type="gramStart"/>
+      <w:r>
+        <w:t>Game::</w:t>
+      </w:r>
+      <w:proofErr w:type="gramEnd"/>
+      <w:r>
+        <w:t>run(). Within the game loop, the system polls events, processes keyboard and mouse input, updates object positions using delta time, evaluates collisions, updates score and lives, checks win or loss state, and renders the frame.</w:t>
       </w:r>
     </w:p>
     <w:p>
       <w:r>
-        <w:t xml:space="preserve">Supporting modules keep a few responsibilities separated. </w:t>
-      </w:r>
-      <w:proofErr w:type="spellStart"/>
-      <w:r>
-        <w:t>GameConstants.h</w:t>
-      </w:r>
-      <w:proofErr w:type="spellEnd"/>
-      <w:r>
-        <w:t xml:space="preserve"> stores tunable values for the window, paddle, ball, and brick layout. </w:t>
-      </w:r>
-      <w:proofErr w:type="spellStart"/>
-      <w:r>
-        <w:t>GameHelpers.h</w:t>
-      </w:r>
-      <w:proofErr w:type="spellEnd"/>
-      <w:r>
-        <w:t xml:space="preserve"> contains small pure helper functions for paddle clamping, life decrement protection, and remaining-brick checks. </w:t>
-      </w:r>
-      <w:proofErr w:type="spellStart"/>
-      <w:r>
-        <w:t>src</w:t>
-      </w:r>
-      <w:proofErr w:type="spellEnd"/>
-      <w:r>
-        <w:t>/</w:t>
-      </w:r>
-      <w:proofErr w:type="spellStart"/>
-      <w:r>
-        <w:t>PhysicsManager.h</w:t>
-      </w:r>
-      <w:proofErr w:type="spellEnd"/>
-      <w:r>
-        <w:t xml:space="preserve"> stores ball velocity and reflection helpers. </w:t>
-      </w:r>
-      <w:proofErr w:type="spellStart"/>
-      <w:r>
-        <w:t>src</w:t>
-      </w:r>
-      <w:proofErr w:type="spellEnd"/>
-      <w:r>
-        <w:t>/</w:t>
-      </w:r>
-      <w:proofErr w:type="spellStart"/>
-      <w:r>
-        <w:t>GameManager.h</w:t>
-      </w:r>
-      <w:proofErr w:type="spellEnd"/>
-      <w:r>
-        <w:t xml:space="preserve"> and </w:t>
-      </w:r>
-      <w:proofErr w:type="spellStart"/>
-      <w:r>
-        <w:t>src</w:t>
-      </w:r>
-      <w:proofErr w:type="spellEnd"/>
-      <w:r>
-        <w:t>/GameManager.cpp manage life state and game-state tracking. This architecture is intentionally lightweight for Phase I and supports later refactoring into more granular modules.</w:t>
+        <w:t>Supporting modules keep a few responsibilities separated. GameConstants.h stores tunable values for the window, paddle, ball, and brick layout. GameHelpers.h contains small pure helper functions for paddle clamping, life decrement protection, and remaining-brick checks. src/PhysicsManager.h stores ball velocity and reflection helpers. src/GameManager.h and src/GameManager.cpp manage life state and game-state tracking. This architecture is intentionally lightweight for Phase I and supports later refactoring into more granular modules.</w:t>
       </w:r>
     </w:p>
     <w:p>
@@ -971,6 +979,9 @@
         <w:tc>
           <w:tcPr>
             <w:tcW w:w="2880" w:type="dxa"/>
+            <w:tcBorders>
+              <w:bottom w:val="single" w:sz="4" w:space="0" w:color="auto"/>
+            </w:tcBorders>
             <w:tcMar>
               <w:top w:w="85" w:type="dxa"/>
               <w:left w:w="110" w:type="dxa"/>
@@ -987,6 +998,9 @@
         <w:tc>
           <w:tcPr>
             <w:tcW w:w="2952" w:type="dxa"/>
+            <w:tcBorders>
+              <w:bottom w:val="single" w:sz="4" w:space="0" w:color="auto"/>
+            </w:tcBorders>
             <w:tcMar>
               <w:top w:w="85" w:type="dxa"/>
               <w:left w:w="110" w:type="dxa"/>
@@ -1003,6 +1017,9 @@
         <w:tc>
           <w:tcPr>
             <w:tcW w:w="1710" w:type="dxa"/>
+            <w:tcBorders>
+              <w:bottom w:val="single" w:sz="4" w:space="0" w:color="auto"/>
+            </w:tcBorders>
             <w:tcMar>
               <w:top w:w="85" w:type="dxa"/>
               <w:left w:w="110" w:type="dxa"/>
@@ -1028,6 +1045,9 @@
         <w:tc>
           <w:tcPr>
             <w:tcW w:w="4338" w:type="dxa"/>
+            <w:tcBorders>
+              <w:bottom w:val="single" w:sz="4" w:space="0" w:color="auto"/>
+            </w:tcBorders>
             <w:tcMar>
               <w:top w:w="85" w:type="dxa"/>
               <w:left w:w="110" w:type="dxa"/>
@@ -1073,6 +1093,10 @@
         <w:tc>
           <w:tcPr>
             <w:tcW w:w="2880" w:type="dxa"/>
+            <w:tcBorders>
+              <w:top w:val="single" w:sz="4" w:space="0" w:color="auto"/>
+              <w:bottom w:val="single" w:sz="4" w:space="0" w:color="auto"/>
+            </w:tcBorders>
             <w:tcMar>
               <w:top w:w="85" w:type="dxa"/>
               <w:left w:w="110" w:type="dxa"/>
@@ -1089,6 +1113,10 @@
         <w:tc>
           <w:tcPr>
             <w:tcW w:w="2952" w:type="dxa"/>
+            <w:tcBorders>
+              <w:top w:val="single" w:sz="4" w:space="0" w:color="auto"/>
+              <w:bottom w:val="single" w:sz="4" w:space="0" w:color="auto"/>
+            </w:tcBorders>
             <w:tcMar>
               <w:top w:w="85" w:type="dxa"/>
               <w:left w:w="110" w:type="dxa"/>
@@ -1105,6 +1133,10 @@
         <w:tc>
           <w:tcPr>
             <w:tcW w:w="1710" w:type="dxa"/>
+            <w:tcBorders>
+              <w:top w:val="single" w:sz="4" w:space="0" w:color="auto"/>
+              <w:bottom w:val="single" w:sz="4" w:space="0" w:color="auto"/>
+            </w:tcBorders>
             <w:tcMar>
               <w:top w:w="85" w:type="dxa"/>
               <w:left w:w="110" w:type="dxa"/>
@@ -1130,6 +1162,10 @@
         <w:tc>
           <w:tcPr>
             <w:tcW w:w="4338" w:type="dxa"/>
+            <w:tcBorders>
+              <w:top w:val="single" w:sz="4" w:space="0" w:color="auto"/>
+              <w:bottom w:val="single" w:sz="4" w:space="0" w:color="auto"/>
+            </w:tcBorders>
             <w:tcMar>
               <w:top w:w="85" w:type="dxa"/>
               <w:left w:w="110" w:type="dxa"/>
@@ -1141,11 +1177,19 @@
             <w:r>
               <w:t>Implemented in </w:t>
             </w:r>
+            <w:proofErr w:type="gramStart"/>
             <w:r>
               <w:rPr>
                 <w:highlight w:val="lightGray"/>
               </w:rPr>
-              <w:t>Game::run()</w:t>
+              <w:t>Game::</w:t>
+            </w:r>
+            <w:proofErr w:type="gramEnd"/>
+            <w:r>
+              <w:rPr>
+                <w:highlight w:val="lightGray"/>
+              </w:rPr>
+              <w:t>run()</w:t>
             </w:r>
             <w:r>
               <w:t> with event handling, delta-time updates, rendering, and display loop.</w:t>
@@ -1160,6 +1204,10 @@
         <w:tc>
           <w:tcPr>
             <w:tcW w:w="2880" w:type="dxa"/>
+            <w:tcBorders>
+              <w:top w:val="single" w:sz="4" w:space="0" w:color="auto"/>
+              <w:bottom w:val="single" w:sz="4" w:space="0" w:color="auto"/>
+            </w:tcBorders>
             <w:tcMar>
               <w:top w:w="85" w:type="dxa"/>
               <w:left w:w="110" w:type="dxa"/>
@@ -1176,6 +1224,10 @@
         <w:tc>
           <w:tcPr>
             <w:tcW w:w="2952" w:type="dxa"/>
+            <w:tcBorders>
+              <w:top w:val="single" w:sz="4" w:space="0" w:color="auto"/>
+              <w:bottom w:val="single" w:sz="4" w:space="0" w:color="auto"/>
+            </w:tcBorders>
             <w:tcMar>
               <w:top w:w="85" w:type="dxa"/>
               <w:left w:w="110" w:type="dxa"/>
@@ -1192,6 +1244,10 @@
         <w:tc>
           <w:tcPr>
             <w:tcW w:w="1710" w:type="dxa"/>
+            <w:tcBorders>
+              <w:top w:val="single" w:sz="4" w:space="0" w:color="auto"/>
+              <w:bottom w:val="single" w:sz="4" w:space="0" w:color="auto"/>
+            </w:tcBorders>
             <w:tcMar>
               <w:top w:w="85" w:type="dxa"/>
               <w:left w:w="110" w:type="dxa"/>
@@ -1217,6 +1273,10 @@
         <w:tc>
           <w:tcPr>
             <w:tcW w:w="4338" w:type="dxa"/>
+            <w:tcBorders>
+              <w:top w:val="single" w:sz="4" w:space="0" w:color="auto"/>
+              <w:bottom w:val="single" w:sz="4" w:space="0" w:color="auto"/>
+            </w:tcBorders>
             <w:tcMar>
               <w:top w:w="85" w:type="dxa"/>
               <w:left w:w="110" w:type="dxa"/>
@@ -1238,6 +1298,10 @@
         <w:tc>
           <w:tcPr>
             <w:tcW w:w="2880" w:type="dxa"/>
+            <w:tcBorders>
+              <w:top w:val="single" w:sz="4" w:space="0" w:color="auto"/>
+              <w:bottom w:val="single" w:sz="4" w:space="0" w:color="auto"/>
+            </w:tcBorders>
             <w:tcMar>
               <w:top w:w="85" w:type="dxa"/>
               <w:left w:w="110" w:type="dxa"/>
@@ -1254,6 +1318,10 @@
         <w:tc>
           <w:tcPr>
             <w:tcW w:w="2952" w:type="dxa"/>
+            <w:tcBorders>
+              <w:top w:val="single" w:sz="4" w:space="0" w:color="auto"/>
+              <w:bottom w:val="single" w:sz="4" w:space="0" w:color="auto"/>
+            </w:tcBorders>
             <w:tcMar>
               <w:top w:w="85" w:type="dxa"/>
               <w:left w:w="110" w:type="dxa"/>
@@ -1270,6 +1338,10 @@
         <w:tc>
           <w:tcPr>
             <w:tcW w:w="1710" w:type="dxa"/>
+            <w:tcBorders>
+              <w:top w:val="single" w:sz="4" w:space="0" w:color="auto"/>
+              <w:bottom w:val="single" w:sz="4" w:space="0" w:color="auto"/>
+            </w:tcBorders>
             <w:tcMar>
               <w:top w:w="85" w:type="dxa"/>
               <w:left w:w="110" w:type="dxa"/>
@@ -1295,6 +1367,10 @@
         <w:tc>
           <w:tcPr>
             <w:tcW w:w="4338" w:type="dxa"/>
+            <w:tcBorders>
+              <w:top w:val="single" w:sz="4" w:space="0" w:color="auto"/>
+              <w:bottom w:val="single" w:sz="4" w:space="0" w:color="auto"/>
+            </w:tcBorders>
             <w:tcMar>
               <w:top w:w="85" w:type="dxa"/>
               <w:left w:w="110" w:type="dxa"/>
@@ -1316,6 +1392,10 @@
         <w:tc>
           <w:tcPr>
             <w:tcW w:w="2880" w:type="dxa"/>
+            <w:tcBorders>
+              <w:top w:val="single" w:sz="4" w:space="0" w:color="auto"/>
+              <w:bottom w:val="single" w:sz="4" w:space="0" w:color="auto"/>
+            </w:tcBorders>
             <w:tcMar>
               <w:top w:w="85" w:type="dxa"/>
               <w:left w:w="110" w:type="dxa"/>
@@ -1332,6 +1412,10 @@
         <w:tc>
           <w:tcPr>
             <w:tcW w:w="2952" w:type="dxa"/>
+            <w:tcBorders>
+              <w:top w:val="single" w:sz="4" w:space="0" w:color="auto"/>
+              <w:bottom w:val="single" w:sz="4" w:space="0" w:color="auto"/>
+            </w:tcBorders>
             <w:tcMar>
               <w:top w:w="85" w:type="dxa"/>
               <w:left w:w="110" w:type="dxa"/>
@@ -1348,6 +1432,10 @@
         <w:tc>
           <w:tcPr>
             <w:tcW w:w="1710" w:type="dxa"/>
+            <w:tcBorders>
+              <w:top w:val="single" w:sz="4" w:space="0" w:color="auto"/>
+              <w:bottom w:val="single" w:sz="4" w:space="0" w:color="auto"/>
+            </w:tcBorders>
             <w:tcMar>
               <w:top w:w="85" w:type="dxa"/>
               <w:left w:w="110" w:type="dxa"/>
@@ -1373,6 +1461,10 @@
         <w:tc>
           <w:tcPr>
             <w:tcW w:w="4338" w:type="dxa"/>
+            <w:tcBorders>
+              <w:top w:val="single" w:sz="4" w:space="0" w:color="auto"/>
+              <w:bottom w:val="single" w:sz="4" w:space="0" w:color="auto"/>
+            </w:tcBorders>
             <w:tcMar>
               <w:top w:w="85" w:type="dxa"/>
               <w:left w:w="110" w:type="dxa"/>
@@ -1405,6 +1497,10 @@
         <w:tc>
           <w:tcPr>
             <w:tcW w:w="2880" w:type="dxa"/>
+            <w:tcBorders>
+              <w:top w:val="single" w:sz="4" w:space="0" w:color="auto"/>
+              <w:bottom w:val="single" w:sz="4" w:space="0" w:color="auto"/>
+            </w:tcBorders>
             <w:tcMar>
               <w:top w:w="85" w:type="dxa"/>
               <w:left w:w="110" w:type="dxa"/>
@@ -1421,6 +1517,10 @@
         <w:tc>
           <w:tcPr>
             <w:tcW w:w="2952" w:type="dxa"/>
+            <w:tcBorders>
+              <w:top w:val="single" w:sz="4" w:space="0" w:color="auto"/>
+              <w:bottom w:val="single" w:sz="4" w:space="0" w:color="auto"/>
+            </w:tcBorders>
             <w:tcMar>
               <w:top w:w="85" w:type="dxa"/>
               <w:left w:w="110" w:type="dxa"/>
@@ -1437,6 +1537,10 @@
         <w:tc>
           <w:tcPr>
             <w:tcW w:w="1710" w:type="dxa"/>
+            <w:tcBorders>
+              <w:top w:val="single" w:sz="4" w:space="0" w:color="auto"/>
+              <w:bottom w:val="single" w:sz="4" w:space="0" w:color="auto"/>
+            </w:tcBorders>
             <w:tcMar>
               <w:top w:w="85" w:type="dxa"/>
               <w:left w:w="110" w:type="dxa"/>
@@ -1462,6 +1566,10 @@
         <w:tc>
           <w:tcPr>
             <w:tcW w:w="4338" w:type="dxa"/>
+            <w:tcBorders>
+              <w:top w:val="single" w:sz="4" w:space="0" w:color="auto"/>
+              <w:bottom w:val="single" w:sz="4" w:space="0" w:color="auto"/>
+            </w:tcBorders>
             <w:tcMar>
               <w:top w:w="85" w:type="dxa"/>
               <w:left w:w="110" w:type="dxa"/>
@@ -1483,6 +1591,10 @@
         <w:tc>
           <w:tcPr>
             <w:tcW w:w="2880" w:type="dxa"/>
+            <w:tcBorders>
+              <w:top w:val="single" w:sz="4" w:space="0" w:color="auto"/>
+              <w:bottom w:val="single" w:sz="4" w:space="0" w:color="auto"/>
+            </w:tcBorders>
             <w:tcMar>
               <w:top w:w="85" w:type="dxa"/>
               <w:left w:w="110" w:type="dxa"/>
@@ -1499,6 +1611,10 @@
         <w:tc>
           <w:tcPr>
             <w:tcW w:w="2952" w:type="dxa"/>
+            <w:tcBorders>
+              <w:top w:val="single" w:sz="4" w:space="0" w:color="auto"/>
+              <w:bottom w:val="single" w:sz="4" w:space="0" w:color="auto"/>
+            </w:tcBorders>
             <w:tcMar>
               <w:top w:w="85" w:type="dxa"/>
               <w:left w:w="110" w:type="dxa"/>
@@ -1515,6 +1631,10 @@
         <w:tc>
           <w:tcPr>
             <w:tcW w:w="1710" w:type="dxa"/>
+            <w:tcBorders>
+              <w:top w:val="single" w:sz="4" w:space="0" w:color="auto"/>
+              <w:bottom w:val="single" w:sz="4" w:space="0" w:color="auto"/>
+            </w:tcBorders>
             <w:tcMar>
               <w:top w:w="85" w:type="dxa"/>
               <w:left w:w="110" w:type="dxa"/>
@@ -1540,6 +1660,10 @@
         <w:tc>
           <w:tcPr>
             <w:tcW w:w="4338" w:type="dxa"/>
+            <w:tcBorders>
+              <w:top w:val="single" w:sz="4" w:space="0" w:color="auto"/>
+              <w:bottom w:val="single" w:sz="4" w:space="0" w:color="auto"/>
+            </w:tcBorders>
             <w:tcMar>
               <w:top w:w="85" w:type="dxa"/>
               <w:left w:w="110" w:type="dxa"/>
@@ -1561,6 +1685,10 @@
         <w:tc>
           <w:tcPr>
             <w:tcW w:w="2880" w:type="dxa"/>
+            <w:tcBorders>
+              <w:top w:val="single" w:sz="4" w:space="0" w:color="auto"/>
+              <w:bottom w:val="single" w:sz="4" w:space="0" w:color="auto"/>
+            </w:tcBorders>
             <w:tcMar>
               <w:top w:w="85" w:type="dxa"/>
               <w:left w:w="110" w:type="dxa"/>
@@ -1577,6 +1705,10 @@
         <w:tc>
           <w:tcPr>
             <w:tcW w:w="2952" w:type="dxa"/>
+            <w:tcBorders>
+              <w:top w:val="single" w:sz="4" w:space="0" w:color="auto"/>
+              <w:bottom w:val="single" w:sz="4" w:space="0" w:color="auto"/>
+            </w:tcBorders>
             <w:tcMar>
               <w:top w:w="85" w:type="dxa"/>
               <w:left w:w="110" w:type="dxa"/>
@@ -1593,6 +1725,10 @@
         <w:tc>
           <w:tcPr>
             <w:tcW w:w="1710" w:type="dxa"/>
+            <w:tcBorders>
+              <w:top w:val="single" w:sz="4" w:space="0" w:color="auto"/>
+              <w:bottom w:val="single" w:sz="4" w:space="0" w:color="auto"/>
+            </w:tcBorders>
             <w:tcMar>
               <w:top w:w="85" w:type="dxa"/>
               <w:left w:w="110" w:type="dxa"/>
@@ -1618,6 +1754,10 @@
         <w:tc>
           <w:tcPr>
             <w:tcW w:w="4338" w:type="dxa"/>
+            <w:tcBorders>
+              <w:top w:val="single" w:sz="4" w:space="0" w:color="auto"/>
+              <w:bottom w:val="single" w:sz="4" w:space="0" w:color="auto"/>
+            </w:tcBorders>
             <w:tcMar>
               <w:top w:w="85" w:type="dxa"/>
               <w:left w:w="110" w:type="dxa"/>
@@ -1639,6 +1779,9 @@
         <w:tc>
           <w:tcPr>
             <w:tcW w:w="2880" w:type="dxa"/>
+            <w:tcBorders>
+              <w:top w:val="single" w:sz="4" w:space="0" w:color="auto"/>
+            </w:tcBorders>
             <w:tcMar>
               <w:top w:w="85" w:type="dxa"/>
               <w:left w:w="110" w:type="dxa"/>
@@ -1648,6 +1791,7 @@
           </w:tcPr>
           <w:p>
             <w:r>
+              <w:lastRenderedPageBreak/>
               <w:t>Menu / GUI screens</w:t>
             </w:r>
           </w:p>
@@ -1655,6 +1799,9 @@
         <w:tc>
           <w:tcPr>
             <w:tcW w:w="2952" w:type="dxa"/>
+            <w:tcBorders>
+              <w:top w:val="single" w:sz="4" w:space="0" w:color="auto"/>
+            </w:tcBorders>
             <w:tcMar>
               <w:top w:w="85" w:type="dxa"/>
               <w:left w:w="110" w:type="dxa"/>
@@ -1664,17 +1811,16 @@
           </w:tcPr>
           <w:p>
             <w:r>
-              <w:t xml:space="preserve">Optional in Phase I unless basic screen flow was </w:t>
-            </w:r>
-            <w:r>
-              <w:lastRenderedPageBreak/>
-              <w:t>completed early.</w:t>
+              <w:t>Optional in Phase I unless basic screen flow was completed early.</w:t>
             </w:r>
           </w:p>
         </w:tc>
         <w:tc>
           <w:tcPr>
             <w:tcW w:w="1710" w:type="dxa"/>
+            <w:tcBorders>
+              <w:top w:val="single" w:sz="4" w:space="0" w:color="auto"/>
+            </w:tcBorders>
             <w:tcMar>
               <w:top w:w="85" w:type="dxa"/>
               <w:left w:w="110" w:type="dxa"/>
@@ -1687,7 +1833,6 @@
               <w:jc w:val="center"/>
             </w:pPr>
             <w:r>
-              <w:lastRenderedPageBreak/>
               <w:t>[</w:t>
             </w:r>
             <w:r>
@@ -1701,6 +1846,9 @@
         <w:tc>
           <w:tcPr>
             <w:tcW w:w="4338" w:type="dxa"/>
+            <w:tcBorders>
+              <w:top w:val="single" w:sz="4" w:space="0" w:color="auto"/>
+            </w:tcBorders>
             <w:tcMar>
               <w:top w:w="85" w:type="dxa"/>
               <w:left w:w="110" w:type="dxa"/>
@@ -1710,11 +1858,7 @@
           </w:tcPr>
           <w:p>
             <w:r>
-              <w:t xml:space="preserve">Main menu and settings screen are implemented. Settings adjust paddle and </w:t>
-            </w:r>
-            <w:r>
-              <w:lastRenderedPageBreak/>
-              <w:t>ball speed multipliers. A fallback title-bar menu is used if no HUD font can be loaded.</w:t>
+              <w:t>Main menu and settings screen are implemented. Settings adjust paddle and ball speed multipliers. A fallback title-bar menu is used if no HUD font can be loaded.</w:t>
             </w:r>
           </w:p>
         </w:tc>
@@ -1735,92 +1879,200 @@
     </w:p>
     <w:p>
       <w:r>
-        <w:t>The Phase I repository contains two code paths, but the graded implementation is the root-level Phase I executable. The active entry point is `phase1_main.cpp`, which launches the root `Game` implementation in `</w:t>
-      </w:r>
-      <w:proofErr w:type="spellStart"/>
-      <w:r>
+        <w:t xml:space="preserve">The Phase I repository contains two code paths, but the graded implementation is the root-level Phase I executable. The active entry point is </w:t>
+      </w:r>
+      <w:r>
+        <w:t>‘</w:t>
+      </w:r>
+      <w:r>
+        <w:rPr>
+          <w:i/>
+          <w:iCs/>
+        </w:rPr>
+        <w:t>phase1_main.cpp</w:t>
+      </w:r>
+      <w:r>
+        <w:t>’</w:t>
+      </w:r>
+      <w:r>
+        <w:t xml:space="preserve">, which launches the root </w:t>
+      </w:r>
+      <w:r>
+        <w:t>‘</w:t>
+      </w:r>
+      <w:r>
+        <w:t>Game</w:t>
+      </w:r>
+      <w:r>
+        <w:t>’</w:t>
+      </w:r>
+      <w:r>
+        <w:t xml:space="preserve"> implementation in </w:t>
+      </w:r>
+      <w:r>
+        <w:t>‘</w:t>
+      </w:r>
+      <w:r>
+        <w:rPr>
+          <w:i/>
+          <w:iCs/>
+        </w:rPr>
         <w:t>Game.h</w:t>
       </w:r>
-      <w:proofErr w:type="spellEnd"/>
-      <w:r>
-        <w:t>` and `Game.cpp`. That code depends on `</w:t>
-      </w:r>
-      <w:proofErr w:type="spellStart"/>
-      <w:r>
+      <w:r>
+        <w:t>’</w:t>
+      </w:r>
+      <w:r>
+        <w:t xml:space="preserve"> and </w:t>
+      </w:r>
+      <w:r>
+        <w:t>‘</w:t>
+      </w:r>
+      <w:r>
+        <w:rPr>
+          <w:i/>
+          <w:iCs/>
+        </w:rPr>
+        <w:t>Game.cpp</w:t>
+      </w:r>
+      <w:r>
+        <w:t>’</w:t>
+      </w:r>
+      <w:r>
+        <w:t xml:space="preserve">. That code depends on </w:t>
+      </w:r>
+      <w:r>
+        <w:t>‘</w:t>
+      </w:r>
+      <w:r>
+        <w:rPr>
+          <w:i/>
+          <w:iCs/>
+        </w:rPr>
         <w:t>GameConstants.h</w:t>
       </w:r>
-      <w:proofErr w:type="spellEnd"/>
-      <w:r>
-        <w:t>`, `</w:t>
-      </w:r>
-      <w:proofErr w:type="spellStart"/>
-      <w:r>
+      <w:proofErr w:type="gramStart"/>
+      <w:r>
+        <w:t>’</w:t>
+      </w:r>
+      <w:r>
+        <w:t xml:space="preserve">, </w:t>
+      </w:r>
+      <w:r>
+        <w:t>‘</w:t>
+      </w:r>
+      <w:proofErr w:type="gramEnd"/>
+      <w:r>
+        <w:rPr>
+          <w:i/>
+          <w:iCs/>
+        </w:rPr>
         <w:t>GameHelpers.h</w:t>
       </w:r>
-      <w:proofErr w:type="spellEnd"/>
-      <w:r>
-        <w:t>`, `</w:t>
-      </w:r>
-      <w:proofErr w:type="spellStart"/>
-      <w:r>
-        <w:t>src</w:t>
-      </w:r>
-      <w:proofErr w:type="spellEnd"/>
-      <w:r>
-        <w:t>/</w:t>
-      </w:r>
-      <w:proofErr w:type="spellStart"/>
-      <w:r>
-        <w:t>GameManager.h</w:t>
-      </w:r>
-      <w:proofErr w:type="spellEnd"/>
-      <w:r>
-        <w:t>`, `</w:t>
-      </w:r>
-      <w:proofErr w:type="spellStart"/>
-      <w:r>
-        <w:t>src</w:t>
-      </w:r>
-      <w:proofErr w:type="spellEnd"/>
-      <w:r>
-        <w:t>/GameManager.cpp`, and `</w:t>
-      </w:r>
-      <w:proofErr w:type="spellStart"/>
-      <w:r>
-        <w:t>src</w:t>
-      </w:r>
-      <w:proofErr w:type="spellEnd"/>
-      <w:r>
-        <w:t>/</w:t>
-      </w:r>
-      <w:proofErr w:type="spellStart"/>
-      <w:r>
-        <w:t>PhysicsManager.h</w:t>
-      </w:r>
-      <w:proofErr w:type="spellEnd"/>
-      <w:r>
-        <w:t>`. Supporting assets are stored in `assets/`, while project documentation is stored in `docs/`.</w:t>
+      <w:proofErr w:type="gramStart"/>
+      <w:r>
+        <w:t>’</w:t>
+      </w:r>
+      <w:r>
+        <w:t xml:space="preserve">, </w:t>
+      </w:r>
+      <w:r>
+        <w:t>‘</w:t>
+      </w:r>
+      <w:proofErr w:type="gramEnd"/>
+      <w:r>
+        <w:rPr>
+          <w:i/>
+          <w:iCs/>
+        </w:rPr>
+        <w:t>src/GameManager.h</w:t>
+      </w:r>
+      <w:proofErr w:type="gramStart"/>
+      <w:r>
+        <w:t>’</w:t>
+      </w:r>
+      <w:r>
+        <w:t xml:space="preserve">, </w:t>
+      </w:r>
+      <w:r>
+        <w:t>‘</w:t>
+      </w:r>
+      <w:proofErr w:type="gramEnd"/>
+      <w:r>
+        <w:rPr>
+          <w:i/>
+          <w:iCs/>
+        </w:rPr>
+        <w:t>src/GameManager.cpp</w:t>
+      </w:r>
+      <w:r>
+        <w:t>’</w:t>
+      </w:r>
+      <w:r>
+        <w:t xml:space="preserve">, and </w:t>
+      </w:r>
+      <w:r>
+        <w:t>‘</w:t>
+      </w:r>
+      <w:r>
+        <w:rPr>
+          <w:i/>
+          <w:iCs/>
+        </w:rPr>
+        <w:t>src/PhysicsManager.h</w:t>
+      </w:r>
+      <w:r>
+        <w:t>’</w:t>
+      </w:r>
+      <w:r>
+        <w:t xml:space="preserve">. Supporting assets are stored in </w:t>
+      </w:r>
+      <w:r>
+        <w:t>‘</w:t>
+      </w:r>
+      <w:r>
+        <w:rPr>
+          <w:i/>
+          <w:iCs/>
+        </w:rPr>
+        <w:t>assets/</w:t>
+      </w:r>
+      <w:r>
+        <w:t>’</w:t>
+      </w:r>
+      <w:r>
+        <w:t>, while project documentation is stored in</w:t>
+      </w:r>
+      <w:r>
+        <w:t xml:space="preserve"> ‘</w:t>
+      </w:r>
+      <w:r>
+        <w:rPr>
+          <w:i/>
+          <w:iCs/>
+        </w:rPr>
+        <w:t>docs/</w:t>
+      </w:r>
+      <w:r>
+        <w:t>’</w:t>
+      </w:r>
+      <w:r>
+        <w:t>.</w:t>
       </w:r>
     </w:p>
     <w:p>
       <w:pPr>
+        <w:spacing w:after="0" w:line="240" w:lineRule="auto"/>
         <w:ind w:left="720"/>
       </w:pPr>
-      <w:proofErr w:type="spellStart"/>
-      <w:r>
-        <w:t>BreakoutGame</w:t>
-      </w:r>
-      <w:proofErr w:type="spellEnd"/>
-      <w:r>
-        <w:t>/</w:t>
+      <w:r>
+        <w:t>BreakoutGame/</w:t>
       </w:r>
     </w:p>
     <w:p>
       <w:pPr>
+        <w:spacing w:after="0" w:line="240" w:lineRule="auto"/>
         <w:ind w:left="720"/>
-        <w:rPr>
-          <w:rFonts w:hint="eastAsia"/>
-        </w:rPr>
       </w:pPr>
       <w:r>
         <w:rPr>
@@ -1832,16 +2084,524 @@
         <w:rPr>
           <w:rFonts w:hint="eastAsia"/>
         </w:rPr>
-        <w:t xml:space="preserve"> .</w:t>
-      </w:r>
-      <w:proofErr w:type="spellStart"/>
+        <w:t xml:space="preserve"> .vscode/</w:t>
+      </w:r>
+    </w:p>
+    <w:p>
+      <w:pPr>
+        <w:spacing w:after="0" w:line="240" w:lineRule="auto"/>
+        <w:ind w:left="720"/>
+      </w:pPr>
       <w:r>
         <w:rPr>
           <w:rFonts w:hint="eastAsia"/>
         </w:rPr>
-        <w:t>vscode</w:t>
-      </w:r>
-      <w:proofErr w:type="spellEnd"/>
+        <w:t>├──</w:t>
+      </w:r>
+      <w:r>
+        <w:rPr>
+          <w:rFonts w:hint="eastAsia"/>
+        </w:rPr>
+        <w:t xml:space="preserve"> assets/</w:t>
+      </w:r>
+    </w:p>
+    <w:p>
+      <w:pPr>
+        <w:spacing w:after="0" w:line="240" w:lineRule="auto"/>
+        <w:ind w:left="720"/>
+      </w:pPr>
+      <w:r>
+        <w:rPr>
+          <w:rFonts w:hint="eastAsia"/>
+        </w:rPr>
+        <w:t>│</w:t>
+      </w:r>
+      <w:r>
+        <w:rPr>
+          <w:rFonts w:hint="eastAsia"/>
+        </w:rPr>
+        <w:t xml:space="preserve">   </w:t>
+      </w:r>
+      <w:r>
+        <w:rPr>
+          <w:rFonts w:hint="eastAsia"/>
+        </w:rPr>
+        <w:t>└──</w:t>
+      </w:r>
+      <w:r>
+        <w:rPr>
+          <w:rFonts w:hint="eastAsia"/>
+        </w:rPr>
+        <w:t xml:space="preserve"> fonts/</w:t>
+      </w:r>
+    </w:p>
+    <w:p>
+      <w:pPr>
+        <w:spacing w:after="0" w:line="240" w:lineRule="auto"/>
+        <w:ind w:left="720"/>
+      </w:pPr>
+      <w:r>
+        <w:rPr>
+          <w:rFonts w:hint="eastAsia"/>
+        </w:rPr>
+        <w:t>├──</w:t>
+      </w:r>
+      <w:r>
+        <w:rPr>
+          <w:rFonts w:hint="eastAsia"/>
+        </w:rPr>
+        <w:t xml:space="preserve"> docs/</w:t>
+      </w:r>
+    </w:p>
+    <w:p>
+      <w:pPr>
+        <w:spacing w:after="0" w:line="240" w:lineRule="auto"/>
+        <w:ind w:left="720"/>
+      </w:pPr>
+      <w:r>
+        <w:rPr>
+          <w:rFonts w:hint="eastAsia"/>
+        </w:rPr>
+        <w:t>│</w:t>
+      </w:r>
+      <w:r>
+        <w:rPr>
+          <w:rFonts w:hint="eastAsia"/>
+        </w:rPr>
+        <w:t xml:space="preserve">   </w:t>
+      </w:r>
+      <w:r>
+        <w:rPr>
+          <w:rFonts w:hint="eastAsia"/>
+        </w:rPr>
+        <w:t>├──</w:t>
+      </w:r>
+      <w:r>
+        <w:rPr>
+          <w:rFonts w:hint="eastAsia"/>
+        </w:rPr>
+        <w:t xml:space="preserve"> 00_master/</w:t>
+      </w:r>
+    </w:p>
+    <w:p>
+      <w:pPr>
+        <w:spacing w:after="0" w:line="240" w:lineRule="auto"/>
+        <w:ind w:left="720"/>
+      </w:pPr>
+      <w:r>
+        <w:rPr>
+          <w:rFonts w:hint="eastAsia"/>
+        </w:rPr>
+        <w:t>│</w:t>
+      </w:r>
+      <w:r>
+        <w:rPr>
+          <w:rFonts w:hint="eastAsia"/>
+        </w:rPr>
+        <w:t xml:space="preserve">   </w:t>
+      </w:r>
+      <w:r>
+        <w:rPr>
+          <w:rFonts w:hint="eastAsia"/>
+        </w:rPr>
+        <w:t>├──</w:t>
+      </w:r>
+      <w:r>
+        <w:rPr>
+          <w:rFonts w:hint="eastAsia"/>
+        </w:rPr>
+        <w:t xml:space="preserve"> 01_features/</w:t>
+      </w:r>
+    </w:p>
+    <w:p>
+      <w:pPr>
+        <w:spacing w:after="0" w:line="240" w:lineRule="auto"/>
+        <w:ind w:left="720"/>
+      </w:pPr>
+      <w:r>
+        <w:rPr>
+          <w:rFonts w:hint="eastAsia"/>
+        </w:rPr>
+        <w:t>│</w:t>
+      </w:r>
+      <w:r>
+        <w:rPr>
+          <w:rFonts w:hint="eastAsia"/>
+        </w:rPr>
+        <w:t xml:space="preserve">   </w:t>
+      </w:r>
+      <w:r>
+        <w:rPr>
+          <w:rFonts w:hint="eastAsia"/>
+        </w:rPr>
+        <w:t>└──</w:t>
+      </w:r>
+      <w:r>
+        <w:rPr>
+          <w:rFonts w:hint="eastAsia"/>
+        </w:rPr>
+        <w:t xml:space="preserve"> 02_management/</w:t>
+      </w:r>
+    </w:p>
+    <w:p>
+      <w:pPr>
+        <w:spacing w:after="0" w:line="240" w:lineRule="auto"/>
+        <w:ind w:left="720"/>
+      </w:pPr>
+      <w:r>
+        <w:rPr>
+          <w:rFonts w:hint="eastAsia"/>
+        </w:rPr>
+        <w:t>├──</w:t>
+      </w:r>
+      <w:r>
+        <w:rPr>
+          <w:rFonts w:hint="eastAsia"/>
+        </w:rPr>
+        <w:t xml:space="preserve"> scripts/</w:t>
+      </w:r>
+    </w:p>
+    <w:p>
+      <w:pPr>
+        <w:spacing w:after="0" w:line="240" w:lineRule="auto"/>
+        <w:ind w:left="720"/>
+      </w:pPr>
+      <w:r>
+        <w:rPr>
+          <w:rFonts w:hint="eastAsia"/>
+        </w:rPr>
+        <w:t>│</w:t>
+      </w:r>
+      <w:r>
+        <w:rPr>
+          <w:rFonts w:hint="eastAsia"/>
+        </w:rPr>
+        <w:t xml:space="preserve">   </w:t>
+      </w:r>
+      <w:r>
+        <w:rPr>
+          <w:rFonts w:hint="eastAsia"/>
+        </w:rPr>
+        <w:t>├──</w:t>
+      </w:r>
+      <w:r>
+        <w:rPr>
+          <w:rFonts w:hint="eastAsia"/>
+        </w:rPr>
+        <w:t xml:space="preserve"> Resolve-Toolchain.ps1</w:t>
+      </w:r>
+    </w:p>
+    <w:p>
+      <w:pPr>
+        <w:spacing w:after="0" w:line="240" w:lineRule="auto"/>
+        <w:ind w:left="720"/>
+      </w:pPr>
+      <w:r>
+        <w:rPr>
+          <w:rFonts w:hint="eastAsia"/>
+        </w:rPr>
+        <w:t>│</w:t>
+      </w:r>
+      <w:r>
+        <w:rPr>
+          <w:rFonts w:hint="eastAsia"/>
+        </w:rPr>
+        <w:t xml:space="preserve">   </w:t>
+      </w:r>
+      <w:r>
+        <w:rPr>
+          <w:rFonts w:hint="eastAsia"/>
+        </w:rPr>
+        <w:t>├──</w:t>
+      </w:r>
+      <w:r>
+        <w:rPr>
+          <w:rFonts w:hint="eastAsia"/>
+        </w:rPr>
+        <w:t xml:space="preserve"> build-phase1.ps1</w:t>
+      </w:r>
+    </w:p>
+    <w:p>
+      <w:pPr>
+        <w:spacing w:after="0" w:line="240" w:lineRule="auto"/>
+        <w:ind w:left="720"/>
+      </w:pPr>
+      <w:r>
+        <w:rPr>
+          <w:rFonts w:hint="eastAsia"/>
+        </w:rPr>
+        <w:t>│</w:t>
+      </w:r>
+      <w:r>
+        <w:rPr>
+          <w:rFonts w:hint="eastAsia"/>
+        </w:rPr>
+        <w:t xml:space="preserve">   </w:t>
+      </w:r>
+      <w:r>
+        <w:rPr>
+          <w:rFonts w:hint="eastAsia"/>
+        </w:rPr>
+        <w:t>└──</w:t>
+      </w:r>
+      <w:r>
+        <w:rPr>
+          <w:rFonts w:hint="eastAsia"/>
+        </w:rPr>
+        <w:t xml:space="preserve"> run-game.ps1</w:t>
+      </w:r>
+    </w:p>
+    <w:p>
+      <w:pPr>
+        <w:spacing w:after="0" w:line="240" w:lineRule="auto"/>
+        <w:ind w:left="720"/>
+      </w:pPr>
+      <w:r>
+        <w:rPr>
+          <w:rFonts w:hint="eastAsia"/>
+        </w:rPr>
+        <w:t>├──</w:t>
+      </w:r>
+      <w:r>
+        <w:rPr>
+          <w:rFonts w:hint="eastAsia"/>
+        </w:rPr>
+        <w:t xml:space="preserve"> src/</w:t>
+      </w:r>
+    </w:p>
+    <w:p>
+      <w:pPr>
+        <w:spacing w:after="0" w:line="240" w:lineRule="auto"/>
+        <w:ind w:left="720"/>
+      </w:pPr>
+      <w:r>
+        <w:rPr>
+          <w:rFonts w:hint="eastAsia"/>
+        </w:rPr>
+        <w:t>│</w:t>
+      </w:r>
+      <w:r>
+        <w:rPr>
+          <w:rFonts w:hint="eastAsia"/>
+        </w:rPr>
+        <w:t xml:space="preserve">   </w:t>
+      </w:r>
+      <w:r>
+        <w:rPr>
+          <w:rFonts w:hint="eastAsia"/>
+        </w:rPr>
+        <w:t>├──</w:t>
+      </w:r>
+      <w:r>
+        <w:rPr>
+          <w:rFonts w:hint="eastAsia"/>
+        </w:rPr>
+        <w:t xml:space="preserve"> Block.cpp</w:t>
+      </w:r>
+    </w:p>
+    <w:p>
+      <w:pPr>
+        <w:spacing w:after="0" w:line="240" w:lineRule="auto"/>
+        <w:ind w:left="720"/>
+      </w:pPr>
+      <w:r>
+        <w:rPr>
+          <w:rFonts w:hint="eastAsia"/>
+        </w:rPr>
+        <w:t>│</w:t>
+      </w:r>
+      <w:r>
+        <w:rPr>
+          <w:rFonts w:hint="eastAsia"/>
+        </w:rPr>
+        <w:t xml:space="preserve">   </w:t>
+      </w:r>
+      <w:r>
+        <w:rPr>
+          <w:rFonts w:hint="eastAsia"/>
+        </w:rPr>
+        <w:t>├──</w:t>
+      </w:r>
+      <w:r>
+        <w:rPr>
+          <w:rFonts w:hint="eastAsia"/>
+        </w:rPr>
+        <w:t xml:space="preserve"> Block.h</w:t>
+      </w:r>
+    </w:p>
+    <w:p>
+      <w:pPr>
+        <w:spacing w:after="0" w:line="240" w:lineRule="auto"/>
+        <w:ind w:left="720"/>
+      </w:pPr>
+      <w:r>
+        <w:rPr>
+          <w:rFonts w:hint="eastAsia"/>
+        </w:rPr>
+        <w:t>│</w:t>
+      </w:r>
+      <w:r>
+        <w:rPr>
+          <w:rFonts w:hint="eastAsia"/>
+        </w:rPr>
+        <w:t xml:space="preserve">   </w:t>
+      </w:r>
+      <w:r>
+        <w:rPr>
+          <w:rFonts w:hint="eastAsia"/>
+        </w:rPr>
+        <w:t>├──</w:t>
+      </w:r>
+      <w:r>
+        <w:rPr>
+          <w:rFonts w:hint="eastAsia"/>
+        </w:rPr>
+        <w:t xml:space="preserve"> GameManager.cpp</w:t>
+      </w:r>
+    </w:p>
+    <w:p>
+      <w:pPr>
+        <w:spacing w:after="0" w:line="240" w:lineRule="auto"/>
+        <w:ind w:left="720"/>
+      </w:pPr>
+      <w:r>
+        <w:rPr>
+          <w:rFonts w:hint="eastAsia"/>
+        </w:rPr>
+        <w:t>│</w:t>
+      </w:r>
+      <w:r>
+        <w:rPr>
+          <w:rFonts w:hint="eastAsia"/>
+        </w:rPr>
+        <w:t xml:space="preserve">   </w:t>
+      </w:r>
+      <w:r>
+        <w:rPr>
+          <w:rFonts w:hint="eastAsia"/>
+        </w:rPr>
+        <w:t>├──</w:t>
+      </w:r>
+      <w:r>
+        <w:rPr>
+          <w:rFonts w:hint="eastAsia"/>
+        </w:rPr>
+        <w:t xml:space="preserve"> GameManager.h</w:t>
+      </w:r>
+    </w:p>
+    <w:p>
+      <w:pPr>
+        <w:spacing w:after="0" w:line="240" w:lineRule="auto"/>
+        <w:ind w:left="720"/>
+      </w:pPr>
+      <w:r>
+        <w:rPr>
+          <w:rFonts w:hint="eastAsia"/>
+        </w:rPr>
+        <w:t>│</w:t>
+      </w:r>
+      <w:r>
+        <w:rPr>
+          <w:rFonts w:hint="eastAsia"/>
+        </w:rPr>
+        <w:t xml:space="preserve">   </w:t>
+      </w:r>
+      <w:r>
+        <w:rPr>
+          <w:rFonts w:hint="eastAsia"/>
+        </w:rPr>
+        <w:t>├──</w:t>
+      </w:r>
+      <w:r>
+        <w:rPr>
+          <w:rFonts w:hint="eastAsia"/>
+        </w:rPr>
+        <w:t xml:space="preserve"> Level.h</w:t>
+      </w:r>
+    </w:p>
+    <w:p>
+      <w:pPr>
+        <w:spacing w:after="0" w:line="240" w:lineRule="auto"/>
+        <w:ind w:left="720"/>
+      </w:pPr>
+      <w:r>
+        <w:rPr>
+          <w:rFonts w:hint="eastAsia"/>
+        </w:rPr>
+        <w:t>│</w:t>
+      </w:r>
+      <w:r>
+        <w:rPr>
+          <w:rFonts w:hint="eastAsia"/>
+        </w:rPr>
+        <w:t xml:space="preserve">   </w:t>
+      </w:r>
+      <w:r>
+        <w:rPr>
+          <w:rFonts w:hint="eastAsia"/>
+        </w:rPr>
+        <w:t>├──</w:t>
+      </w:r>
+      <w:r>
+        <w:rPr>
+          <w:rFonts w:hint="eastAsia"/>
+        </w:rPr>
+        <w:t xml:space="preserve"> PhysicsManager.h</w:t>
+      </w:r>
+    </w:p>
+    <w:p>
+      <w:pPr>
+        <w:spacing w:after="0" w:line="240" w:lineRule="auto"/>
+        <w:ind w:left="720"/>
+      </w:pPr>
+      <w:r>
+        <w:rPr>
+          <w:rFonts w:hint="eastAsia"/>
+        </w:rPr>
+        <w:t>│</w:t>
+      </w:r>
+      <w:r>
+        <w:rPr>
+          <w:rFonts w:hint="eastAsia"/>
+        </w:rPr>
+        <w:t xml:space="preserve">   </w:t>
+      </w:r>
+      <w:r>
+        <w:rPr>
+          <w:rFonts w:hint="eastAsia"/>
+        </w:rPr>
+        <w:t>└──</w:t>
+      </w:r>
+      <w:r>
+        <w:rPr>
+          <w:rFonts w:hint="eastAsia"/>
+        </w:rPr>
+        <w:t xml:space="preserve"> main.cpp</w:t>
+      </w:r>
+    </w:p>
+    <w:p>
+      <w:pPr>
+        <w:spacing w:after="0" w:line="240" w:lineRule="auto"/>
+        <w:ind w:left="720"/>
+      </w:pPr>
+      <w:r>
+        <w:rPr>
+          <w:rFonts w:hint="eastAsia"/>
+        </w:rPr>
+        <w:t>├──</w:t>
+      </w:r>
+      <w:r>
+        <w:rPr>
+          <w:rFonts w:hint="eastAsia"/>
+        </w:rPr>
+        <w:t xml:space="preserve"> </w:t>
+      </w:r>
+      <w:r>
+        <w:t>test</w:t>
+      </w:r>
+      <w:r>
+        <w:t>s</w:t>
+      </w:r>
       <w:r>
         <w:rPr>
           <w:rFonts w:hint="eastAsia"/>
@@ -1851,10 +2611,8 @@
     </w:p>
     <w:p>
       <w:pPr>
+        <w:spacing w:after="0" w:line="240" w:lineRule="auto"/>
         <w:ind w:left="720"/>
-        <w:rPr>
-          <w:rFonts w:hint="eastAsia"/>
-        </w:rPr>
       </w:pPr>
       <w:r>
         <w:rPr>
@@ -1866,47 +2624,13 @@
         <w:rPr>
           <w:rFonts w:hint="eastAsia"/>
         </w:rPr>
-        <w:t xml:space="preserve"> assets/</w:t>
+        <w:t xml:space="preserve"> Game.cpp</w:t>
       </w:r>
     </w:p>
     <w:p>
       <w:pPr>
+        <w:spacing w:after="0" w:line="240" w:lineRule="auto"/>
         <w:ind w:left="720"/>
-        <w:rPr>
-          <w:rFonts w:hint="eastAsia"/>
-        </w:rPr>
-      </w:pPr>
-      <w:r>
-        <w:rPr>
-          <w:rFonts w:hint="eastAsia"/>
-        </w:rPr>
-        <w:t>│</w:t>
-      </w:r>
-      <w:r>
-        <w:rPr>
-          <w:rFonts w:hint="eastAsia"/>
-        </w:rPr>
-        <w:t xml:space="preserve">   </w:t>
-      </w:r>
-      <w:r>
-        <w:rPr>
-          <w:rFonts w:hint="eastAsia"/>
-        </w:rPr>
-        <w:t>└──</w:t>
-      </w:r>
-      <w:r>
-        <w:rPr>
-          <w:rFonts w:hint="eastAsia"/>
-        </w:rPr>
-        <w:t xml:space="preserve"> fonts/</w:t>
-      </w:r>
-    </w:p>
-    <w:p>
-      <w:pPr>
-        <w:ind w:left="720"/>
-        <w:rPr>
-          <w:rFonts w:hint="eastAsia"/>
-        </w:rPr>
       </w:pPr>
       <w:r>
         <w:rPr>
@@ -1918,28 +2642,14 @@
         <w:rPr>
           <w:rFonts w:hint="eastAsia"/>
         </w:rPr>
-        <w:t xml:space="preserve"> docs/</w:t>
+        <w:t xml:space="preserve"> Game.h</w:t>
       </w:r>
     </w:p>
     <w:p>
       <w:pPr>
+        <w:spacing w:after="0" w:line="240" w:lineRule="auto"/>
         <w:ind w:left="720"/>
-        <w:rPr>
-          <w:rFonts w:hint="eastAsia"/>
-        </w:rPr>
       </w:pPr>
-      <w:r>
-        <w:rPr>
-          <w:rFonts w:hint="eastAsia"/>
-        </w:rPr>
-        <w:t>│</w:t>
-      </w:r>
-      <w:r>
-        <w:rPr>
-          <w:rFonts w:hint="eastAsia"/>
-        </w:rPr>
-        <w:t xml:space="preserve">   </w:t>
-      </w:r>
       <w:r>
         <w:rPr>
           <w:rFonts w:hint="eastAsia"/>
@@ -1950,28 +2660,14 @@
         <w:rPr>
           <w:rFonts w:hint="eastAsia"/>
         </w:rPr>
-        <w:t xml:space="preserve"> 00_master/</w:t>
+        <w:t xml:space="preserve"> GameConstants.h</w:t>
       </w:r>
     </w:p>
     <w:p>
       <w:pPr>
+        <w:spacing w:after="0" w:line="240" w:lineRule="auto"/>
         <w:ind w:left="720"/>
-        <w:rPr>
-          <w:rFonts w:hint="eastAsia"/>
-        </w:rPr>
       </w:pPr>
-      <w:r>
-        <w:rPr>
-          <w:rFonts w:hint="eastAsia"/>
-        </w:rPr>
-        <w:t>│</w:t>
-      </w:r>
-      <w:r>
-        <w:rPr>
-          <w:rFonts w:hint="eastAsia"/>
-        </w:rPr>
-        <w:t xml:space="preserve">   </w:t>
-      </w:r>
       <w:r>
         <w:rPr>
           <w:rFonts w:hint="eastAsia"/>
@@ -1982,47 +2678,13 @@
         <w:rPr>
           <w:rFonts w:hint="eastAsia"/>
         </w:rPr>
-        <w:t xml:space="preserve"> 01_features/</w:t>
+        <w:t xml:space="preserve"> GameHelpers.h</w:t>
       </w:r>
     </w:p>
     <w:p>
       <w:pPr>
+        <w:spacing w:after="0" w:line="240" w:lineRule="auto"/>
         <w:ind w:left="720"/>
-        <w:rPr>
-          <w:rFonts w:hint="eastAsia"/>
-        </w:rPr>
-      </w:pPr>
-      <w:r>
-        <w:rPr>
-          <w:rFonts w:hint="eastAsia"/>
-        </w:rPr>
-        <w:t>│</w:t>
-      </w:r>
-      <w:r>
-        <w:rPr>
-          <w:rFonts w:hint="eastAsia"/>
-        </w:rPr>
-        <w:t xml:space="preserve">   </w:t>
-      </w:r>
-      <w:r>
-        <w:rPr>
-          <w:rFonts w:hint="eastAsia"/>
-        </w:rPr>
-        <w:t>└──</w:t>
-      </w:r>
-      <w:r>
-        <w:rPr>
-          <w:rFonts w:hint="eastAsia"/>
-        </w:rPr>
-        <w:t xml:space="preserve"> 02_management/</w:t>
-      </w:r>
-    </w:p>
-    <w:p>
-      <w:pPr>
-        <w:ind w:left="720"/>
-        <w:rPr>
-          <w:rFonts w:hint="eastAsia"/>
-        </w:rPr>
       </w:pPr>
       <w:r>
         <w:rPr>
@@ -2034,28 +2696,14 @@
         <w:rPr>
           <w:rFonts w:hint="eastAsia"/>
         </w:rPr>
-        <w:t xml:space="preserve"> scripts/</w:t>
+        <w:t xml:space="preserve"> phase1_main.cpp</w:t>
       </w:r>
     </w:p>
     <w:p>
       <w:pPr>
+        <w:spacing w:after="0" w:line="240" w:lineRule="auto"/>
         <w:ind w:left="720"/>
-        <w:rPr>
-          <w:rFonts w:hint="eastAsia"/>
-        </w:rPr>
       </w:pPr>
-      <w:r>
-        <w:rPr>
-          <w:rFonts w:hint="eastAsia"/>
-        </w:rPr>
-        <w:t>│</w:t>
-      </w:r>
-      <w:r>
-        <w:rPr>
-          <w:rFonts w:hint="eastAsia"/>
-        </w:rPr>
-        <w:t xml:space="preserve">   </w:t>
-      </w:r>
       <w:r>
         <w:rPr>
           <w:rFonts w:hint="eastAsia"/>
@@ -2063,31 +2711,20 @@
         <w:t>├──</w:t>
       </w:r>
       <w:r>
-        <w:rPr>
-          <w:rFonts w:hint="eastAsia"/>
-        </w:rPr>
-        <w:t xml:space="preserve"> Resolve-Toolchain.ps1</w:t>
+        <w:t xml:space="preserve"> CMake</w:t>
+      </w:r>
+      <w:r>
+        <w:t>L</w:t>
+      </w:r>
+      <w:r>
+        <w:t>ists.txt</w:t>
       </w:r>
     </w:p>
     <w:p>
       <w:pPr>
+        <w:spacing w:after="0" w:line="240" w:lineRule="auto"/>
         <w:ind w:left="720"/>
-        <w:rPr>
-          <w:rFonts w:hint="eastAsia"/>
-        </w:rPr>
       </w:pPr>
-      <w:r>
-        <w:rPr>
-          <w:rFonts w:hint="eastAsia"/>
-        </w:rPr>
-        <w:t>│</w:t>
-      </w:r>
-      <w:r>
-        <w:rPr>
-          <w:rFonts w:hint="eastAsia"/>
-        </w:rPr>
-        <w:t xml:space="preserve">   </w:t>
-      </w:r>
       <w:r>
         <w:rPr>
           <w:rFonts w:hint="eastAsia"/>
@@ -2095,536 +2732,13 @@
         <w:t>├──</w:t>
       </w:r>
       <w:r>
-        <w:rPr>
-          <w:rFonts w:hint="eastAsia"/>
-        </w:rPr>
-        <w:t xml:space="preserve"> build-phase1.ps1</w:t>
+        <w:t xml:space="preserve"> CMakePresets.json</w:t>
       </w:r>
     </w:p>
     <w:p>
       <w:pPr>
+        <w:spacing w:after="0" w:line="240" w:lineRule="auto"/>
         <w:ind w:left="720"/>
-        <w:rPr>
-          <w:rFonts w:hint="eastAsia"/>
-        </w:rPr>
-      </w:pPr>
-      <w:r>
-        <w:rPr>
-          <w:rFonts w:hint="eastAsia"/>
-        </w:rPr>
-        <w:t>│</w:t>
-      </w:r>
-      <w:r>
-        <w:rPr>
-          <w:rFonts w:hint="eastAsia"/>
-        </w:rPr>
-        <w:t xml:space="preserve">   </w:t>
-      </w:r>
-      <w:r>
-        <w:rPr>
-          <w:rFonts w:hint="eastAsia"/>
-        </w:rPr>
-        <w:t>└──</w:t>
-      </w:r>
-      <w:r>
-        <w:rPr>
-          <w:rFonts w:hint="eastAsia"/>
-        </w:rPr>
-        <w:t xml:space="preserve"> run-game.ps1</w:t>
-      </w:r>
-    </w:p>
-    <w:p>
-      <w:pPr>
-        <w:ind w:left="720"/>
-        <w:rPr>
-          <w:rFonts w:hint="eastAsia"/>
-        </w:rPr>
-      </w:pPr>
-      <w:r>
-        <w:rPr>
-          <w:rFonts w:hint="eastAsia"/>
-        </w:rPr>
-        <w:t>├──</w:t>
-      </w:r>
-      <w:r>
-        <w:rPr>
-          <w:rFonts w:hint="eastAsia"/>
-        </w:rPr>
-        <w:t xml:space="preserve"> </w:t>
-      </w:r>
-      <w:proofErr w:type="spellStart"/>
-      <w:r>
-        <w:rPr>
-          <w:rFonts w:hint="eastAsia"/>
-        </w:rPr>
-        <w:t>src</w:t>
-      </w:r>
-      <w:proofErr w:type="spellEnd"/>
-      <w:r>
-        <w:rPr>
-          <w:rFonts w:hint="eastAsia"/>
-        </w:rPr>
-        <w:t>/</w:t>
-      </w:r>
-    </w:p>
-    <w:p>
-      <w:pPr>
-        <w:ind w:left="720"/>
-        <w:rPr>
-          <w:rFonts w:hint="eastAsia"/>
-        </w:rPr>
-      </w:pPr>
-      <w:r>
-        <w:rPr>
-          <w:rFonts w:hint="eastAsia"/>
-        </w:rPr>
-        <w:t>│</w:t>
-      </w:r>
-      <w:r>
-        <w:rPr>
-          <w:rFonts w:hint="eastAsia"/>
-        </w:rPr>
-        <w:t xml:space="preserve">   </w:t>
-      </w:r>
-      <w:r>
-        <w:rPr>
-          <w:rFonts w:hint="eastAsia"/>
-        </w:rPr>
-        <w:t>├──</w:t>
-      </w:r>
-      <w:r>
-        <w:rPr>
-          <w:rFonts w:hint="eastAsia"/>
-        </w:rPr>
-        <w:t xml:space="preserve"> Block.cpp</w:t>
-      </w:r>
-    </w:p>
-    <w:p>
-      <w:pPr>
-        <w:ind w:left="720"/>
-        <w:rPr>
-          <w:rFonts w:hint="eastAsia"/>
-        </w:rPr>
-      </w:pPr>
-      <w:r>
-        <w:rPr>
-          <w:rFonts w:hint="eastAsia"/>
-        </w:rPr>
-        <w:t>│</w:t>
-      </w:r>
-      <w:r>
-        <w:rPr>
-          <w:rFonts w:hint="eastAsia"/>
-        </w:rPr>
-        <w:t xml:space="preserve">   </w:t>
-      </w:r>
-      <w:r>
-        <w:rPr>
-          <w:rFonts w:hint="eastAsia"/>
-        </w:rPr>
-        <w:t>├──</w:t>
-      </w:r>
-      <w:r>
-        <w:rPr>
-          <w:rFonts w:hint="eastAsia"/>
-        </w:rPr>
-        <w:t xml:space="preserve"> </w:t>
-      </w:r>
-      <w:proofErr w:type="spellStart"/>
-      <w:r>
-        <w:rPr>
-          <w:rFonts w:hint="eastAsia"/>
-        </w:rPr>
-        <w:t>Block.h</w:t>
-      </w:r>
-      <w:proofErr w:type="spellEnd"/>
-    </w:p>
-    <w:p>
-      <w:pPr>
-        <w:ind w:left="720"/>
-        <w:rPr>
-          <w:rFonts w:hint="eastAsia"/>
-        </w:rPr>
-      </w:pPr>
-      <w:r>
-        <w:rPr>
-          <w:rFonts w:hint="eastAsia"/>
-        </w:rPr>
-        <w:t>│</w:t>
-      </w:r>
-      <w:r>
-        <w:rPr>
-          <w:rFonts w:hint="eastAsia"/>
-        </w:rPr>
-        <w:t xml:space="preserve">   </w:t>
-      </w:r>
-      <w:r>
-        <w:rPr>
-          <w:rFonts w:hint="eastAsia"/>
-        </w:rPr>
-        <w:t>├──</w:t>
-      </w:r>
-      <w:r>
-        <w:rPr>
-          <w:rFonts w:hint="eastAsia"/>
-        </w:rPr>
-        <w:t xml:space="preserve"> GameManager.cpp</w:t>
-      </w:r>
-    </w:p>
-    <w:p>
-      <w:pPr>
-        <w:ind w:left="720"/>
-        <w:rPr>
-          <w:rFonts w:hint="eastAsia"/>
-        </w:rPr>
-      </w:pPr>
-      <w:r>
-        <w:rPr>
-          <w:rFonts w:hint="eastAsia"/>
-        </w:rPr>
-        <w:t>│</w:t>
-      </w:r>
-      <w:r>
-        <w:rPr>
-          <w:rFonts w:hint="eastAsia"/>
-        </w:rPr>
-        <w:t xml:space="preserve">   </w:t>
-      </w:r>
-      <w:r>
-        <w:rPr>
-          <w:rFonts w:hint="eastAsia"/>
-        </w:rPr>
-        <w:t>├──</w:t>
-      </w:r>
-      <w:r>
-        <w:rPr>
-          <w:rFonts w:hint="eastAsia"/>
-        </w:rPr>
-        <w:t xml:space="preserve"> </w:t>
-      </w:r>
-      <w:proofErr w:type="spellStart"/>
-      <w:r>
-        <w:rPr>
-          <w:rFonts w:hint="eastAsia"/>
-        </w:rPr>
-        <w:t>GameManager.h</w:t>
-      </w:r>
-      <w:proofErr w:type="spellEnd"/>
-    </w:p>
-    <w:p>
-      <w:pPr>
-        <w:ind w:left="720"/>
-        <w:rPr>
-          <w:rFonts w:hint="eastAsia"/>
-        </w:rPr>
-      </w:pPr>
-      <w:r>
-        <w:rPr>
-          <w:rFonts w:hint="eastAsia"/>
-        </w:rPr>
-        <w:t>│</w:t>
-      </w:r>
-      <w:r>
-        <w:rPr>
-          <w:rFonts w:hint="eastAsia"/>
-        </w:rPr>
-        <w:t xml:space="preserve">   </w:t>
-      </w:r>
-      <w:r>
-        <w:rPr>
-          <w:rFonts w:hint="eastAsia"/>
-        </w:rPr>
-        <w:t>├──</w:t>
-      </w:r>
-      <w:r>
-        <w:rPr>
-          <w:rFonts w:hint="eastAsia"/>
-        </w:rPr>
-        <w:t xml:space="preserve"> </w:t>
-      </w:r>
-      <w:proofErr w:type="spellStart"/>
-      <w:r>
-        <w:rPr>
-          <w:rFonts w:hint="eastAsia"/>
-        </w:rPr>
-        <w:t>Level.h</w:t>
-      </w:r>
-      <w:proofErr w:type="spellEnd"/>
-    </w:p>
-    <w:p>
-      <w:pPr>
-        <w:ind w:left="720"/>
-        <w:rPr>
-          <w:rFonts w:hint="eastAsia"/>
-        </w:rPr>
-      </w:pPr>
-      <w:r>
-        <w:rPr>
-          <w:rFonts w:hint="eastAsia"/>
-        </w:rPr>
-        <w:lastRenderedPageBreak/>
-        <w:t>│</w:t>
-      </w:r>
-      <w:r>
-        <w:rPr>
-          <w:rFonts w:hint="eastAsia"/>
-        </w:rPr>
-        <w:t xml:space="preserve">   </w:t>
-      </w:r>
-      <w:r>
-        <w:rPr>
-          <w:rFonts w:hint="eastAsia"/>
-        </w:rPr>
-        <w:t>├──</w:t>
-      </w:r>
-      <w:r>
-        <w:rPr>
-          <w:rFonts w:hint="eastAsia"/>
-        </w:rPr>
-        <w:t xml:space="preserve"> </w:t>
-      </w:r>
-      <w:proofErr w:type="spellStart"/>
-      <w:r>
-        <w:rPr>
-          <w:rFonts w:hint="eastAsia"/>
-        </w:rPr>
-        <w:t>PhysicsManager.h</w:t>
-      </w:r>
-      <w:proofErr w:type="spellEnd"/>
-    </w:p>
-    <w:p>
-      <w:pPr>
-        <w:ind w:left="720"/>
-        <w:rPr>
-          <w:rFonts w:hint="eastAsia"/>
-        </w:rPr>
-      </w:pPr>
-      <w:r>
-        <w:rPr>
-          <w:rFonts w:hint="eastAsia"/>
-        </w:rPr>
-        <w:t>│</w:t>
-      </w:r>
-      <w:r>
-        <w:rPr>
-          <w:rFonts w:hint="eastAsia"/>
-        </w:rPr>
-        <w:t xml:space="preserve">   </w:t>
-      </w:r>
-      <w:r>
-        <w:rPr>
-          <w:rFonts w:hint="eastAsia"/>
-        </w:rPr>
-        <w:t>└──</w:t>
-      </w:r>
-      <w:r>
-        <w:rPr>
-          <w:rFonts w:hint="eastAsia"/>
-        </w:rPr>
-        <w:t xml:space="preserve"> main.cpp</w:t>
-      </w:r>
-    </w:p>
-    <w:p>
-      <w:pPr>
-        <w:ind w:left="720"/>
-      </w:pPr>
-      <w:r>
-        <w:rPr>
-          <w:rFonts w:hint="eastAsia"/>
-        </w:rPr>
-        <w:t>├──</w:t>
-      </w:r>
-      <w:r>
-        <w:rPr>
-          <w:rFonts w:hint="eastAsia"/>
-        </w:rPr>
-        <w:t xml:space="preserve"> </w:t>
-      </w:r>
-      <w:r>
-        <w:t>test</w:t>
-      </w:r>
-      <w:r>
-        <w:t>s</w:t>
-      </w:r>
-      <w:r>
-        <w:rPr>
-          <w:rFonts w:hint="eastAsia"/>
-        </w:rPr>
-        <w:t>/</w:t>
-      </w:r>
-    </w:p>
-    <w:p>
-      <w:pPr>
-        <w:ind w:left="720"/>
-        <w:rPr>
-          <w:rFonts w:hint="eastAsia"/>
-        </w:rPr>
-      </w:pPr>
-      <w:r>
-        <w:rPr>
-          <w:rFonts w:hint="eastAsia"/>
-        </w:rPr>
-        <w:t>├──</w:t>
-      </w:r>
-      <w:r>
-        <w:rPr>
-          <w:rFonts w:hint="eastAsia"/>
-        </w:rPr>
-        <w:t xml:space="preserve"> Game.cpp</w:t>
-      </w:r>
-    </w:p>
-    <w:p>
-      <w:pPr>
-        <w:ind w:left="720"/>
-        <w:rPr>
-          <w:rFonts w:hint="eastAsia"/>
-        </w:rPr>
-      </w:pPr>
-      <w:r>
-        <w:rPr>
-          <w:rFonts w:hint="eastAsia"/>
-        </w:rPr>
-        <w:t>├──</w:t>
-      </w:r>
-      <w:r>
-        <w:rPr>
-          <w:rFonts w:hint="eastAsia"/>
-        </w:rPr>
-        <w:t xml:space="preserve"> </w:t>
-      </w:r>
-      <w:proofErr w:type="spellStart"/>
-      <w:r>
-        <w:rPr>
-          <w:rFonts w:hint="eastAsia"/>
-        </w:rPr>
-        <w:t>Game.h</w:t>
-      </w:r>
-      <w:proofErr w:type="spellEnd"/>
-    </w:p>
-    <w:p>
-      <w:pPr>
-        <w:ind w:left="720"/>
-        <w:rPr>
-          <w:rFonts w:hint="eastAsia"/>
-        </w:rPr>
-      </w:pPr>
-      <w:r>
-        <w:rPr>
-          <w:rFonts w:hint="eastAsia"/>
-        </w:rPr>
-        <w:t>├──</w:t>
-      </w:r>
-      <w:r>
-        <w:rPr>
-          <w:rFonts w:hint="eastAsia"/>
-        </w:rPr>
-        <w:t xml:space="preserve"> </w:t>
-      </w:r>
-      <w:proofErr w:type="spellStart"/>
-      <w:r>
-        <w:rPr>
-          <w:rFonts w:hint="eastAsia"/>
-        </w:rPr>
-        <w:t>GameConstants.h</w:t>
-      </w:r>
-      <w:proofErr w:type="spellEnd"/>
-    </w:p>
-    <w:p>
-      <w:pPr>
-        <w:ind w:left="720"/>
-        <w:rPr>
-          <w:rFonts w:hint="eastAsia"/>
-        </w:rPr>
-      </w:pPr>
-      <w:r>
-        <w:rPr>
-          <w:rFonts w:hint="eastAsia"/>
-        </w:rPr>
-        <w:t>├──</w:t>
-      </w:r>
-      <w:r>
-        <w:rPr>
-          <w:rFonts w:hint="eastAsia"/>
-        </w:rPr>
-        <w:t xml:space="preserve"> </w:t>
-      </w:r>
-      <w:proofErr w:type="spellStart"/>
-      <w:r>
-        <w:rPr>
-          <w:rFonts w:hint="eastAsia"/>
-        </w:rPr>
-        <w:t>GameHelpers.h</w:t>
-      </w:r>
-      <w:proofErr w:type="spellEnd"/>
-    </w:p>
-    <w:p>
-      <w:pPr>
-        <w:ind w:left="720"/>
-      </w:pPr>
-      <w:r>
-        <w:rPr>
-          <w:rFonts w:hint="eastAsia"/>
-        </w:rPr>
-        <w:t>├──</w:t>
-      </w:r>
-      <w:r>
-        <w:rPr>
-          <w:rFonts w:hint="eastAsia"/>
-        </w:rPr>
-        <w:t xml:space="preserve"> phase1_main.cpp</w:t>
-      </w:r>
-    </w:p>
-    <w:p>
-      <w:pPr>
-        <w:ind w:left="720"/>
-      </w:pPr>
-      <w:r>
-        <w:rPr>
-          <w:rFonts w:hint="eastAsia"/>
-        </w:rPr>
-        <w:t>├──</w:t>
-      </w:r>
-      <w:r>
-        <w:t xml:space="preserve"> CMake</w:t>
-      </w:r>
-      <w:r>
-        <w:t>L</w:t>
-      </w:r>
-      <w:r>
-        <w:t>ists.txt</w:t>
-      </w:r>
-    </w:p>
-    <w:p>
-      <w:pPr>
-        <w:ind w:left="720"/>
-        <w:rPr>
-          <w:rFonts w:hint="eastAsia"/>
-        </w:rPr>
-      </w:pPr>
-      <w:r>
-        <w:rPr>
-          <w:rFonts w:hint="eastAsia"/>
-        </w:rPr>
-        <w:t>├──</w:t>
-      </w:r>
-      <w:r>
-        <w:t xml:space="preserve"> </w:t>
-      </w:r>
-      <w:proofErr w:type="spellStart"/>
-      <w:r>
-        <w:t>CMake</w:t>
-      </w:r>
-      <w:r>
-        <w:t>Presets.json</w:t>
-      </w:r>
-      <w:proofErr w:type="spellEnd"/>
-    </w:p>
-    <w:p>
-      <w:pPr>
-        <w:ind w:left="720"/>
-        <w:rPr>
-          <w:rFonts w:hint="eastAsia"/>
-        </w:rPr>
       </w:pPr>
       <w:r>
         <w:rPr>
@@ -2648,15 +2762,8 @@
         </w:rPr>
       </w:pPr>
       <w:r>
-        <w:t>The repository also contains an earlier prototype in `</w:t>
-      </w:r>
-      <w:proofErr w:type="spellStart"/>
-      <w:r>
-        <w:t>src</w:t>
-      </w:r>
-      <w:proofErr w:type="spellEnd"/>
-      <w:r>
-        <w:t>/main.cpp` and related files. That code remains in the repository for reference, but it is not the primary Phase I submission target. The intended executable for Phase I is `main.exe` built from the repository root sources.</w:t>
+        <w:lastRenderedPageBreak/>
+        <w:t>The repository also contains an earlier prototype in `src/main.cpp` and related files. That code remains in the repository for reference, but it is not the primary Phase I submission target. The intended executable for Phase I is `main.exe` built from the repository root sources.</w:t>
       </w:r>
     </w:p>
     <w:p>
@@ -2688,7 +2795,15 @@
         <w:spacing w:after="40"/>
       </w:pPr>
       <w:r>
-        <w:t>The application starts in phase1_main.cpp, constructs the Game object, and enters the main loop through Game::run(). The loop clamps frame delta time, handles events, processes keyboard shortcuts, updates gameplay state, renders the active screen, and presents the frame. This provides a stable real-time execution cycle for gameplay, menu flow, and settings navigation.</w:t>
+        <w:t>The application starts in phase1_main.cpp, constructs the Game object, and enters the main loop through </w:t>
+      </w:r>
+      <w:proofErr w:type="gramStart"/>
+      <w:r>
+        <w:t>Game::</w:t>
+      </w:r>
+      <w:proofErr w:type="gramEnd"/>
+      <w:r>
+        <w:t>run(). The loop clamps frame delta time, handles events, processes keyboard shortcuts, updates gameplay state, renders the active screen, and presents the frame. This provides a stable real-time execution cycle for gameplay, menu flow, and settings navigation.</w:t>
       </w:r>
     </w:p>
     <w:p>
@@ -2728,7 +2843,23 @@
         <w:spacing w:after="40"/>
       </w:pPr>
       <w:r>
-        <w:t>The ball is initialized near the paddle and launched with a velocity derived from the configured base speed plus small randomized angle and speed variation. During active play, the ball position is updated each frame using delta time so motion remains more consistent across frame-rate changes.</w:t>
+        <w:t xml:space="preserve">The ball is initialized near the paddle and launched with a velocity derived from the configured base speed plus </w:t>
+      </w:r>
+      <w:proofErr w:type="gramStart"/>
+      <w:r>
+        <w:t>small randomized</w:t>
+      </w:r>
+      <w:proofErr w:type="gramEnd"/>
+      <w:r>
+        <w:t xml:space="preserve"> angle and speed variation. During active play, the ball position is updated each frame using delta </w:t>
+      </w:r>
+      <w:proofErr w:type="gramStart"/>
+      <w:r>
+        <w:t>time</w:t>
+      </w:r>
+      <w:proofErr w:type="gramEnd"/>
+      <w:r>
+        <w:t xml:space="preserve"> so motion remains more consistent across frame-rate changes.</w:t>
       </w:r>
     </w:p>
     <w:p>
@@ -2760,7 +2891,6 @@
           <w:b/>
           <w:color w:val="1F1F1F"/>
         </w:rPr>
-        <w:lastRenderedPageBreak/>
         <w:t>Brick interaction</w:t>
       </w:r>
     </w:p>
@@ -2769,7 +2899,15 @@
         <w:spacing w:after="40"/>
       </w:pPr>
       <w:r>
-        <w:t>The game generates a 5x8 brick grid at startup. Each brick stores a shape and an active/inactive state. Active bricks are rendered each frame. When the ball intersects a live brick, that brick is deactivated and removed from future play. The win condition is reached when no active bricks remain.</w:t>
+        <w:t xml:space="preserve">The game generates a 5x8 brick grid at startup. Each brick stores a shape and an active/inactive state. Active bricks are </w:t>
+      </w:r>
+      <w:proofErr w:type="gramStart"/>
+      <w:r>
+        <w:t>rendered</w:t>
+      </w:r>
+      <w:proofErr w:type="gramEnd"/>
+      <w:r>
+        <w:t xml:space="preserve"> each frame. When the ball intersects a live brick, that brick is deactivated and removed from future play. The win condition is reached when no active bricks remain.</w:t>
       </w:r>
     </w:p>
     <w:p>
@@ -2816,6 +2954,9 @@
       <w:tblPr>
         <w:tblW w:w="11736" w:type="dxa"/>
         <w:jc w:val="center"/>
+        <w:tblBorders>
+          <w:insideH w:val="single" w:sz="4" w:space="0" w:color="auto"/>
+        </w:tblBorders>
         <w:tblLayout w:type="fixed"/>
         <w:tblLook w:val="04A0" w:firstRow="1" w:lastRow="0" w:firstColumn="1" w:lastColumn="0" w:noHBand="0" w:noVBand="1"/>
       </w:tblPr>
@@ -2894,6 +3035,7 @@
           </w:tcPr>
           <w:p>
             <w:r>
+              <w:lastRenderedPageBreak/>
               <w:t>Naming conventions</w:t>
             </w:r>
           </w:p>
@@ -2935,15 +3077,7 @@
             </w:r>
             <w:proofErr w:type="spellEnd"/>
             <w:r>
-              <w:t>. Functions and variables use camelCase or lower camel case, and shared constants are centralized in </w:t>
-            </w:r>
-            <w:proofErr w:type="spellStart"/>
-            <w:r>
-              <w:t>GameConstants.h</w:t>
-            </w:r>
-            <w:proofErr w:type="spellEnd"/>
-            <w:r>
-              <w:t>.</w:t>
+              <w:t>. Functions and variables use camelCase or lower camel case, and shared constants are centralized in GameConstants.h.</w:t>
             </w:r>
           </w:p>
         </w:tc>
@@ -3033,6 +3167,9 @@
         <w:tc>
           <w:tcPr>
             <w:tcW w:w="2070" w:type="dxa"/>
+            <w:tcBorders>
+              <w:bottom w:val="single" w:sz="4" w:space="0" w:color="auto"/>
+            </w:tcBorders>
             <w:tcMar>
               <w:top w:w="80" w:type="dxa"/>
               <w:left w:w="110" w:type="dxa"/>
@@ -3050,6 +3187,9 @@
         <w:tc>
           <w:tcPr>
             <w:tcW w:w="9666" w:type="dxa"/>
+            <w:tcBorders>
+              <w:bottom w:val="single" w:sz="4" w:space="0" w:color="auto"/>
+            </w:tcBorders>
             <w:tcMar>
               <w:top w:w="80" w:type="dxa"/>
               <w:left w:w="110" w:type="dxa"/>
@@ -3072,6 +3212,10 @@
         <w:tc>
           <w:tcPr>
             <w:tcW w:w="2070" w:type="dxa"/>
+            <w:tcBorders>
+              <w:top w:val="single" w:sz="4" w:space="0" w:color="auto"/>
+              <w:bottom w:val="single" w:sz="4" w:space="0" w:color="auto"/>
+            </w:tcBorders>
             <w:tcMar>
               <w:top w:w="80" w:type="dxa"/>
               <w:left w:w="110" w:type="dxa"/>
@@ -3089,6 +3233,10 @@
         <w:tc>
           <w:tcPr>
             <w:tcW w:w="9666" w:type="dxa"/>
+            <w:tcBorders>
+              <w:top w:val="single" w:sz="4" w:space="0" w:color="auto"/>
+              <w:bottom w:val="single" w:sz="4" w:space="0" w:color="auto"/>
+            </w:tcBorders>
             <w:tcMar>
               <w:top w:w="80" w:type="dxa"/>
               <w:left w:w="110" w:type="dxa"/>
@@ -3115,7 +3263,6 @@
         <w:rPr>
           <w:color w:val="1F4E78"/>
         </w:rPr>
-        <w:lastRenderedPageBreak/>
         <w:t>8. Testing, Refinement, and Change Tracking</w:t>
       </w:r>
     </w:p>
@@ -3123,6 +3270,9 @@
       <w:tblPr>
         <w:tblW w:w="11448" w:type="dxa"/>
         <w:jc w:val="center"/>
+        <w:tblBorders>
+          <w:insideH w:val="single" w:sz="4" w:space="0" w:color="auto"/>
+        </w:tblBorders>
         <w:tblLayout w:type="fixed"/>
         <w:tblLook w:val="04A0" w:firstRow="1" w:lastRow="0" w:firstColumn="1" w:lastColumn="0" w:noHBand="0" w:noVBand="1"/>
       </w:tblPr>
@@ -3285,7 +3435,16 @@
               <w:jc w:val="center"/>
             </w:pPr>
             <w:r>
-              <w:t>[Pass]</w:t>
+              <w:t>[</w:t>
+            </w:r>
+            <w:r>
+              <w:rPr>
+                <w:highlight w:val="green"/>
+              </w:rPr>
+              <w:t>Pass</w:t>
+            </w:r>
+            <w:r>
+              <w:t>]</w:t>
             </w:r>
           </w:p>
         </w:tc>
@@ -3301,7 +3460,15 @@
           </w:tcPr>
           <w:p>
             <w:r>
-              <w:t xml:space="preserve">Verified on April 7, 2026 using both `scripts/build-phase1.ps1` and the </w:t>
+              <w:t xml:space="preserve">Verified on April 7, </w:t>
+            </w:r>
+            <w:proofErr w:type="gramStart"/>
+            <w:r>
+              <w:t>2026</w:t>
+            </w:r>
+            <w:proofErr w:type="gramEnd"/>
+            <w:r>
+              <w:t xml:space="preserve"> using both `scripts/build-phase1.ps1` and the </w:t>
             </w:r>
             <w:proofErr w:type="spellStart"/>
             <w:r>
@@ -3362,7 +3529,11 @@
           </w:tcPr>
           <w:p>
             <w:r>
-              <w:t>Move paddle continuously left and right and confirm it remains inside the play area.</w:t>
+              <w:t xml:space="preserve">Move paddle continuously left and right and confirm it remains inside </w:t>
+            </w:r>
+            <w:r>
+              <w:lastRenderedPageBreak/>
+              <w:t>the play area.</w:t>
             </w:r>
           </w:p>
         </w:tc>
@@ -3381,9 +3552,13 @@
               <w:jc w:val="center"/>
             </w:pPr>
             <w:r>
+              <w:lastRenderedPageBreak/>
               <w:t>[</w:t>
             </w:r>
             <w:r>
+              <w:rPr>
+                <w:highlight w:val="green"/>
+              </w:rPr>
               <w:t>Pass</w:t>
             </w:r>
             <w:r>
@@ -3403,7 +3578,11 @@
           </w:tcPr>
           <w:p>
             <w:r>
-              <w:t>Behavior is implemented in code and recorded as Pass in `docs/02_management/Phase1_Test_Checklist.md`.</w:t>
+              <w:t>Behavior is implemented in code and recorded as Pass in `docs/02_management/Phase1_Test</w:t>
+            </w:r>
+            <w:r>
+              <w:lastRenderedPageBreak/>
+              <w:t>_Checklist.md`.</w:t>
             </w:r>
           </w:p>
         </w:tc>
@@ -3424,6 +3603,7 @@
           </w:tcPr>
           <w:p>
             <w:r>
+              <w:lastRenderedPageBreak/>
               <w:t>Ball movement test</w:t>
             </w:r>
           </w:p>
@@ -3440,7 +3620,15 @@
           </w:tcPr>
           <w:p>
             <w:r>
-              <w:t>Start gameplay and confirm the ball updates smoothly each frame.</w:t>
+              <w:t xml:space="preserve">Start gameplay and confirm the ball updates </w:t>
+            </w:r>
+            <w:proofErr w:type="gramStart"/>
+            <w:r>
+              <w:t>smoothly</w:t>
+            </w:r>
+            <w:proofErr w:type="gramEnd"/>
+            <w:r>
+              <w:t xml:space="preserve"> each frame.</w:t>
             </w:r>
           </w:p>
         </w:tc>
@@ -3462,6 +3650,9 @@
               <w:t>[</w:t>
             </w:r>
             <w:r>
+              <w:rPr>
+                <w:highlight w:val="green"/>
+              </w:rPr>
               <w:t>Pass</w:t>
             </w:r>
             <w:r>
@@ -3540,9 +3731,15 @@
               <w:t>[</w:t>
             </w:r>
             <w:r>
+              <w:rPr>
+                <w:highlight w:val="green"/>
+              </w:rPr>
               <w:t>P</w:t>
             </w:r>
             <w:r>
+              <w:rPr>
+                <w:highlight w:val="green"/>
+              </w:rPr>
               <w:t>ass</w:t>
             </w:r>
             <w:r>
@@ -3562,7 +3759,23 @@
           </w:tcPr>
           <w:p>
             <w:r>
-              <w:t>Implemented through PhysicsManager::reflectX() and PhysicsManager::reflectY().</w:t>
+              <w:t>Implemented through </w:t>
+            </w:r>
+            <w:proofErr w:type="gramStart"/>
+            <w:r>
+              <w:t>PhysicsManager::</w:t>
+            </w:r>
+            <w:proofErr w:type="gramEnd"/>
+            <w:r>
+              <w:t>reflectX() and </w:t>
+            </w:r>
+            <w:proofErr w:type="gramStart"/>
+            <w:r>
+              <w:t>PhysicsManager::</w:t>
+            </w:r>
+            <w:proofErr w:type="gramEnd"/>
+            <w:r>
+              <w:t>reflectY().</w:t>
             </w:r>
           </w:p>
         </w:tc>
@@ -3621,6 +3834,9 @@
               <w:t>[</w:t>
             </w:r>
             <w:r>
+              <w:rPr>
+                <w:highlight w:val="green"/>
+              </w:rPr>
               <w:t>Pass</w:t>
             </w:r>
             <w:r>
@@ -3652,6 +3868,9 @@
         <w:tc>
           <w:tcPr>
             <w:tcW w:w="1746" w:type="dxa"/>
+            <w:tcBorders>
+              <w:bottom w:val="single" w:sz="4" w:space="0" w:color="auto"/>
+            </w:tcBorders>
             <w:tcMar>
               <w:top w:w="85" w:type="dxa"/>
               <w:left w:w="110" w:type="dxa"/>
@@ -3668,6 +3887,9 @@
         <w:tc>
           <w:tcPr>
             <w:tcW w:w="3510" w:type="dxa"/>
+            <w:tcBorders>
+              <w:bottom w:val="single" w:sz="4" w:space="0" w:color="auto"/>
+            </w:tcBorders>
             <w:tcMar>
               <w:top w:w="85" w:type="dxa"/>
               <w:left w:w="110" w:type="dxa"/>
@@ -3684,6 +3906,9 @@
         <w:tc>
           <w:tcPr>
             <w:tcW w:w="2430" w:type="dxa"/>
+            <w:tcBorders>
+              <w:bottom w:val="single" w:sz="4" w:space="0" w:color="auto"/>
+            </w:tcBorders>
             <w:tcMar>
               <w:top w:w="85" w:type="dxa"/>
               <w:left w:w="110" w:type="dxa"/>
@@ -3699,6 +3924,9 @@
               <w:t>[</w:t>
             </w:r>
             <w:r>
+              <w:rPr>
+                <w:highlight w:val="green"/>
+              </w:rPr>
               <w:t>Pass</w:t>
             </w:r>
             <w:r>
@@ -3709,6 +3937,9 @@
         <w:tc>
           <w:tcPr>
             <w:tcW w:w="3762" w:type="dxa"/>
+            <w:tcBorders>
+              <w:bottom w:val="single" w:sz="4" w:space="0" w:color="auto"/>
+            </w:tcBorders>
             <w:tcMar>
               <w:top w:w="85" w:type="dxa"/>
               <w:left w:w="110" w:type="dxa"/>
@@ -3718,7 +3949,15 @@
           </w:tcPr>
           <w:p>
             <w:r>
-              <w:t>Brick deactivation and score increment are implemented; bounce response is intentionally simple.</w:t>
+              <w:t xml:space="preserve">Brick deactivation and score increment </w:t>
+            </w:r>
+            <w:proofErr w:type="gramStart"/>
+            <w:r>
+              <w:t>are</w:t>
+            </w:r>
+            <w:proofErr w:type="gramEnd"/>
+            <w:r>
+              <w:t xml:space="preserve"> implemented; bounce response is intentionally simple.</w:t>
             </w:r>
           </w:p>
         </w:tc>
@@ -3730,6 +3969,10 @@
         <w:tc>
           <w:tcPr>
             <w:tcW w:w="1746" w:type="dxa"/>
+            <w:tcBorders>
+              <w:top w:val="single" w:sz="4" w:space="0" w:color="auto"/>
+              <w:bottom w:val="single" w:sz="4" w:space="0" w:color="auto"/>
+            </w:tcBorders>
             <w:tcMar>
               <w:top w:w="85" w:type="dxa"/>
               <w:left w:w="110" w:type="dxa"/>
@@ -3746,6 +3989,10 @@
         <w:tc>
           <w:tcPr>
             <w:tcW w:w="3510" w:type="dxa"/>
+            <w:tcBorders>
+              <w:top w:val="single" w:sz="4" w:space="0" w:color="auto"/>
+              <w:bottom w:val="single" w:sz="4" w:space="0" w:color="auto"/>
+            </w:tcBorders>
             <w:tcMar>
               <w:top w:w="85" w:type="dxa"/>
               <w:left w:w="110" w:type="dxa"/>
@@ -3786,6 +4033,10 @@
         <w:tc>
           <w:tcPr>
             <w:tcW w:w="2430" w:type="dxa"/>
+            <w:tcBorders>
+              <w:top w:val="single" w:sz="4" w:space="0" w:color="auto"/>
+              <w:bottom w:val="single" w:sz="4" w:space="0" w:color="auto"/>
+            </w:tcBorders>
             <w:tcMar>
               <w:top w:w="85" w:type="dxa"/>
               <w:left w:w="110" w:type="dxa"/>
@@ -3798,13 +4049,26 @@
               <w:jc w:val="center"/>
             </w:pPr>
             <w:r>
-              <w:t>[Pass]</w:t>
+              <w:t>[</w:t>
+            </w:r>
+            <w:r>
+              <w:rPr>
+                <w:highlight w:val="green"/>
+              </w:rPr>
+              <w:t>Pass</w:t>
+            </w:r>
+            <w:r>
+              <w:t>]</w:t>
             </w:r>
           </w:p>
         </w:tc>
         <w:tc>
           <w:tcPr>
             <w:tcW w:w="3762" w:type="dxa"/>
+            <w:tcBorders>
+              <w:top w:val="single" w:sz="4" w:space="0" w:color="auto"/>
+              <w:bottom w:val="single" w:sz="4" w:space="0" w:color="auto"/>
+            </w:tcBorders>
             <w:tcMar>
               <w:top w:w="85" w:type="dxa"/>
               <w:left w:w="110" w:type="dxa"/>
@@ -3834,7 +4098,6 @@
         </w:rPr>
       </w:pPr>
       <w:r>
-        <w:lastRenderedPageBreak/>
         <w:t>Change tracking should be tied to Git/GitHub activity. Current branch: main. Current reviewed commit: d94ddaea89df618d48b0169f3c9101fe114c9a2d. Recent repository work includes menu improvements, collision and physics refinements, font fallback handling, and a portability update that removed hardcoded local compiler paths from the shared build configuration.</w:t>
       </w:r>
       <w:r>
@@ -3868,6 +4131,9 @@
       <w:tblPr>
         <w:tblW w:w="0" w:type="auto"/>
         <w:jc w:val="center"/>
+        <w:tblBorders>
+          <w:insideH w:val="single" w:sz="4" w:space="0" w:color="auto"/>
+        </w:tblBorders>
         <w:tblLayout w:type="fixed"/>
         <w:tblLook w:val="04A0" w:firstRow="1" w:lastRow="0" w:firstColumn="1" w:lastColumn="0" w:noHBand="0" w:noVBand="1"/>
       </w:tblPr>
@@ -3901,6 +4167,7 @@
                 <w:b/>
                 <w:color w:val="FFFFFF"/>
               </w:rPr>
+              <w:lastRenderedPageBreak/>
               <w:t>Issue / Risk</w:t>
             </w:r>
           </w:p>
@@ -4081,6 +4348,9 @@
         <w:tc>
           <w:tcPr>
             <w:tcW w:w="3312" w:type="dxa"/>
+            <w:tcBorders>
+              <w:bottom w:val="single" w:sz="4" w:space="0" w:color="auto"/>
+            </w:tcBorders>
             <w:tcMar>
               <w:top w:w="80" w:type="dxa"/>
               <w:left w:w="110" w:type="dxa"/>
@@ -4098,6 +4368,9 @@
         <w:tc>
           <w:tcPr>
             <w:tcW w:w="3312" w:type="dxa"/>
+            <w:tcBorders>
+              <w:bottom w:val="single" w:sz="4" w:space="0" w:color="auto"/>
+            </w:tcBorders>
             <w:tcMar>
               <w:top w:w="80" w:type="dxa"/>
               <w:left w:w="110" w:type="dxa"/>
@@ -4115,6 +4388,9 @@
         <w:tc>
           <w:tcPr>
             <w:tcW w:w="3312" w:type="dxa"/>
+            <w:tcBorders>
+              <w:bottom w:val="single" w:sz="4" w:space="0" w:color="auto"/>
+            </w:tcBorders>
             <w:tcMar>
               <w:top w:w="80" w:type="dxa"/>
               <w:left w:w="110" w:type="dxa"/>
@@ -4137,6 +4413,10 @@
         <w:tc>
           <w:tcPr>
             <w:tcW w:w="3312" w:type="dxa"/>
+            <w:tcBorders>
+              <w:top w:val="single" w:sz="4" w:space="0" w:color="auto"/>
+              <w:bottom w:val="single" w:sz="4" w:space="0" w:color="auto"/>
+            </w:tcBorders>
             <w:tcMar>
               <w:top w:w="80" w:type="dxa"/>
               <w:left w:w="110" w:type="dxa"/>
@@ -4154,6 +4434,10 @@
         <w:tc>
           <w:tcPr>
             <w:tcW w:w="3312" w:type="dxa"/>
+            <w:tcBorders>
+              <w:top w:val="single" w:sz="4" w:space="0" w:color="auto"/>
+              <w:bottom w:val="single" w:sz="4" w:space="0" w:color="auto"/>
+            </w:tcBorders>
             <w:tcMar>
               <w:top w:w="80" w:type="dxa"/>
               <w:left w:w="110" w:type="dxa"/>
@@ -4171,6 +4455,10 @@
         <w:tc>
           <w:tcPr>
             <w:tcW w:w="3312" w:type="dxa"/>
+            <w:tcBorders>
+              <w:top w:val="single" w:sz="4" w:space="0" w:color="auto"/>
+              <w:bottom w:val="single" w:sz="4" w:space="0" w:color="auto"/>
+            </w:tcBorders>
             <w:tcMar>
               <w:top w:w="80" w:type="dxa"/>
               <w:left w:w="110" w:type="dxa"/>
@@ -4212,6 +4500,9 @@
       <w:tblPr>
         <w:tblW w:w="10224" w:type="dxa"/>
         <w:jc w:val="center"/>
+        <w:tblBorders>
+          <w:insideH w:val="single" w:sz="4" w:space="0" w:color="auto"/>
+        </w:tblBorders>
         <w:tblLayout w:type="fixed"/>
         <w:tblLook w:val="04A0" w:firstRow="1" w:lastRow="0" w:firstColumn="1" w:lastColumn="0" w:noHBand="0" w:noVBand="1"/>
       </w:tblPr>
@@ -4245,7 +4536,6 @@
                 <w:b/>
                 <w:color w:val="FFFFFF"/>
               </w:rPr>
-              <w:lastRenderedPageBreak/>
               <w:t>Team Member</w:t>
             </w:r>
           </w:p>
@@ -4372,13 +4662,8 @@
           </w:tcPr>
           <w:p>
             <w:r>
-              <w:t xml:space="preserve">Ethan </w:t>
-            </w:r>
-            <w:proofErr w:type="spellStart"/>
-            <w:r>
-              <w:t>Wasniak</w:t>
-            </w:r>
-            <w:proofErr w:type="spellEnd"/>
+              <w:t>Ethan Wasniak</w:t>
+            </w:r>
           </w:p>
         </w:tc>
         <w:tc>
@@ -4411,7 +4696,23 @@
           </w:tcPr>
           <w:p>
             <w:r>
-              <w:t>[Insert completed work]</w:t>
+              <w:t xml:space="preserve">Created baseline SFML </w:t>
+            </w:r>
+            <w:r>
+              <w:t xml:space="preserve">application and implemented a prototype that </w:t>
+            </w:r>
+            <w:r>
+              <w:lastRenderedPageBreak/>
+              <w:t>introduc</w:t>
+            </w:r>
+            <w:r>
+              <w:t xml:space="preserve">ed components to the </w:t>
+            </w:r>
+            <w:r>
+              <w:t>application such as paddle input and movement, ball velocity and wall/paddle collision handling</w:t>
+            </w:r>
+            <w:r>
+              <w:t>, and limited game state tracking.</w:t>
             </w:r>
           </w:p>
         </w:tc>
@@ -4433,6 +4734,7 @@
           </w:tcPr>
           <w:p>
             <w:r>
+              <w:lastRenderedPageBreak/>
               <w:t>Kenise Balton</w:t>
             </w:r>
           </w:p>
@@ -4479,6 +4781,9 @@
         <w:tc>
           <w:tcPr>
             <w:tcW w:w="2124" w:type="dxa"/>
+            <w:tcBorders>
+              <w:bottom w:val="single" w:sz="4" w:space="0" w:color="auto"/>
+            </w:tcBorders>
             <w:tcMar>
               <w:top w:w="85" w:type="dxa"/>
               <w:left w:w="110" w:type="dxa"/>
@@ -4496,6 +4801,9 @@
         <w:tc>
           <w:tcPr>
             <w:tcW w:w="4500" w:type="dxa"/>
+            <w:tcBorders>
+              <w:bottom w:val="single" w:sz="4" w:space="0" w:color="auto"/>
+            </w:tcBorders>
             <w:tcMar>
               <w:top w:w="85" w:type="dxa"/>
               <w:left w:w="110" w:type="dxa"/>
@@ -4513,6 +4821,9 @@
         <w:tc>
           <w:tcPr>
             <w:tcW w:w="3600" w:type="dxa"/>
+            <w:tcBorders>
+              <w:bottom w:val="single" w:sz="4" w:space="0" w:color="auto"/>
+            </w:tcBorders>
             <w:tcMar>
               <w:top w:w="85" w:type="dxa"/>
               <w:left w:w="110" w:type="dxa"/>
@@ -4535,6 +4846,10 @@
         <w:tc>
           <w:tcPr>
             <w:tcW w:w="2124" w:type="dxa"/>
+            <w:tcBorders>
+              <w:top w:val="single" w:sz="4" w:space="0" w:color="auto"/>
+              <w:bottom w:val="single" w:sz="4" w:space="0" w:color="auto"/>
+            </w:tcBorders>
             <w:tcMar>
               <w:top w:w="85" w:type="dxa"/>
               <w:left w:w="110" w:type="dxa"/>
@@ -4552,6 +4867,10 @@
         <w:tc>
           <w:tcPr>
             <w:tcW w:w="4500" w:type="dxa"/>
+            <w:tcBorders>
+              <w:top w:val="single" w:sz="4" w:space="0" w:color="auto"/>
+              <w:bottom w:val="single" w:sz="4" w:space="0" w:color="auto"/>
+            </w:tcBorders>
             <w:tcMar>
               <w:top w:w="85" w:type="dxa"/>
               <w:left w:w="110" w:type="dxa"/>
@@ -4569,6 +4888,10 @@
         <w:tc>
           <w:tcPr>
             <w:tcW w:w="3600" w:type="dxa"/>
+            <w:tcBorders>
+              <w:top w:val="single" w:sz="4" w:space="0" w:color="auto"/>
+              <w:bottom w:val="single" w:sz="4" w:space="0" w:color="auto"/>
+            </w:tcBorders>
             <w:tcMar>
               <w:top w:w="85" w:type="dxa"/>
               <w:left w:w="110" w:type="dxa"/>
@@ -4579,7 +4902,15 @@
           </w:tcPr>
           <w:p>
             <w:r>
-              <w:t>Maintained and finalized the Phase I documentation set, including the source code report, README, Phase I source summary, and manual test execution record. Verified documentation accuracy against the live codebase, updated build/setup guidance after the toolchain portability refactor, and recorded final Phase I testing evidence for submission readiness.</w:t>
+              <w:t xml:space="preserve">Maintained and finalized the Phase I documentation set, including the source code report, README, Phase I source summary, and manual test execution record. Verified documentation accuracy against the live codebase, updated build/setup guidance after the toolchain portability </w:t>
+            </w:r>
+            <w:proofErr w:type="gramStart"/>
+            <w:r>
+              <w:t>refactor, and</w:t>
+            </w:r>
+            <w:proofErr w:type="gramEnd"/>
+            <w:r>
+              <w:t xml:space="preserve"> recorded final Phase I testing evidence for submission readiness.</w:t>
             </w:r>
           </w:p>
         </w:tc>
@@ -4600,7 +4931,15 @@
     </w:p>
     <w:p>
       <w:r>
-        <w:t>Phase I has produced a working Breakout prototype with the core gameplay loop, paddle control, ball movement, collision handling, brick interaction, score and life tracking, win/loss states, HUD messaging, restart support, and basic menu flow. The current implementation is stable enough to serve as the project’s playable baseline, and the build configuration has been improved so the project is less dependent on one developer’s exact machine layout.</w:t>
+        <w:t xml:space="preserve">Phase I </w:t>
+      </w:r>
+      <w:proofErr w:type="gramStart"/>
+      <w:r>
+        <w:t>has</w:t>
+      </w:r>
+      <w:proofErr w:type="gramEnd"/>
+      <w:r>
+        <w:t xml:space="preserve"> produced a working Breakout prototype with the core gameplay loop, paddle control, ball movement, collision handling, brick interaction, score and life tracking, win/loss states, HUD messaging, restart support, and basic menu flow. The current implementation is stable enough to serve as the project’s playable baseline, and the build configuration has been improved so the project is less dependent on one developer’s exact machine layout.</w:t>
       </w:r>
     </w:p>
     <w:p>
@@ -4644,6 +4983,7 @@
       </w:r>
     </w:p>
     <w:sectPr>
+      <w:headerReference w:type="default" r:id="rId9"/>
       <w:pgSz w:w="12240" w:h="15840"/>
       <w:pgMar w:top="1008" w:right="1152" w:bottom="1008" w:left="1152" w:header="720" w:footer="720" w:gutter="0"/>
       <w:cols w:space="720"/>
@@ -4651,6 +4991,152 @@
     </w:sectPr>
   </w:body>
 </w:document>
+</file>
+
+<file path=word/endnotes.xml><?xml version="1.0" encoding="utf-8"?>
+<w:endnotes xmlns:wpc="http://schemas.microsoft.com/office/word/2010/wordprocessingCanvas" xmlns:cx="http://schemas.microsoft.com/office/drawing/2014/chartex" xmlns:cx1="http://schemas.microsoft.com/office/drawing/2015/9/8/chartex" xmlns:cx2="http://schemas.microsoft.com/office/drawing/2015/10/21/chartex" xmlns:cx3="http://schemas.microsoft.com/office/drawing/2016/5/9/chartex" xmlns:cx4="http://schemas.microsoft.com/office/drawing/2016/5/10/chartex" xmlns:cx5="http://schemas.microsoft.com/office/drawing/2016/5/11/chartex" xmlns:cx6="http://schemas.microsoft.com/office/drawing/2016/5/12/chartex" xmlns:cx7="http://schemas.microsoft.com/office/drawing/2016/5/13/chartex" xmlns:cx8="http://schemas.microsoft.com/office/drawing/2016/5/14/chartex" xmlns:mc="http://schemas.openxmlformats.org/markup-compatibility/2006" xmlns:aink="http://schemas.microsoft.com/office/drawing/2016/ink" xmlns:am3d="http://schemas.microsoft.com/office/drawing/2017/model3d" xmlns:o="urn:schemas-microsoft-com:office:office" xmlns:oel="http://schemas.microsoft.com/office/2019/extlst" xmlns:r="http://schemas.openxmlformats.org/officeDocument/2006/relationships" xmlns:m="http://schemas.openxmlformats.org/officeDocument/2006/math" xmlns:v="urn:schemas-microsoft-com:vml" xmlns:wp14="http://schemas.microsoft.com/office/word/2010/wordprocessingDrawing" xmlns:wp="http://schemas.openxmlformats.org/drawingml/2006/wordprocessingDrawing" xmlns:w10="urn:schemas-microsoft-com:office:word" xmlns:w="http://schemas.openxmlformats.org/wordprocessingml/2006/main" xmlns:w14="http://schemas.microsoft.com/office/word/2010/wordml" xmlns:w15="http://schemas.microsoft.com/office/word/2012/wordml" xmlns:w16cex="http://schemas.microsoft.com/office/word/2018/wordml/cex" xmlns:w16cid="http://schemas.microsoft.com/office/word/2016/wordml/cid" xmlns:w16="http://schemas.microsoft.com/office/word/2018/wordml" xmlns:w16du="http://schemas.microsoft.com/office/word/2023/wordml/word16du" xmlns:w16sdtdh="http://schemas.microsoft.com/office/word/2020/wordml/sdtdatahash" xmlns:w16sdtfl="http://schemas.microsoft.com/office/word/2024/wordml/sdtformatlock" xmlns:w16se="http://schemas.microsoft.com/office/word/2015/wordml/symex" xmlns:wpg="http://schemas.microsoft.com/office/word/2010/wordprocessingGroup" xmlns:wpi="http://schemas.microsoft.com/office/word/2010/wordprocessingInk" xmlns:wne="http://schemas.microsoft.com/office/word/2006/wordml" xmlns:wps="http://schemas.microsoft.com/office/word/2010/wordprocessingShape" mc:Ignorable="w14 w15 w16se w16cid w16 w16cex w16sdtdh w16sdtfl w16du wp14">
+  <w:endnote w:type="separator" w:id="-1">
+    <w:p>
+      <w:pPr>
+        <w:spacing w:after="0" w:line="240" w:lineRule="auto"/>
+      </w:pPr>
+      <w:r>
+        <w:separator/>
+      </w:r>
+    </w:p>
+  </w:endnote>
+  <w:endnote w:type="continuationSeparator" w:id="0">
+    <w:p>
+      <w:pPr>
+        <w:spacing w:after="0" w:line="240" w:lineRule="auto"/>
+      </w:pPr>
+      <w:r>
+        <w:continuationSeparator/>
+      </w:r>
+    </w:p>
+  </w:endnote>
+</w:endnotes>
+</file>
+
+<file path=word/footnotes.xml><?xml version="1.0" encoding="utf-8"?>
+<w:footnotes xmlns:wpc="http://schemas.microsoft.com/office/word/2010/wordprocessingCanvas" xmlns:cx="http://schemas.microsoft.com/office/drawing/2014/chartex" xmlns:cx1="http://schemas.microsoft.com/office/drawing/2015/9/8/chartex" xmlns:cx2="http://schemas.microsoft.com/office/drawing/2015/10/21/chartex" xmlns:cx3="http://schemas.microsoft.com/office/drawing/2016/5/9/chartex" xmlns:cx4="http://schemas.microsoft.com/office/drawing/2016/5/10/chartex" xmlns:cx5="http://schemas.microsoft.com/office/drawing/2016/5/11/chartex" xmlns:cx6="http://schemas.microsoft.com/office/drawing/2016/5/12/chartex" xmlns:cx7="http://schemas.microsoft.com/office/drawing/2016/5/13/chartex" xmlns:cx8="http://schemas.microsoft.com/office/drawing/2016/5/14/chartex" xmlns:mc="http://schemas.openxmlformats.org/markup-compatibility/2006" xmlns:aink="http://schemas.microsoft.com/office/drawing/2016/ink" xmlns:am3d="http://schemas.microsoft.com/office/drawing/2017/model3d" xmlns:o="urn:schemas-microsoft-com:office:office" xmlns:oel="http://schemas.microsoft.com/office/2019/extlst" xmlns:r="http://schemas.openxmlformats.org/officeDocument/2006/relationships" xmlns:m="http://schemas.openxmlformats.org/officeDocument/2006/math" xmlns:v="urn:schemas-microsoft-com:vml" xmlns:wp14="http://schemas.microsoft.com/office/word/2010/wordprocessingDrawing" xmlns:wp="http://schemas.openxmlformats.org/drawingml/2006/wordprocessingDrawing" xmlns:w10="urn:schemas-microsoft-com:office:word" xmlns:w="http://schemas.openxmlformats.org/wordprocessingml/2006/main" xmlns:w14="http://schemas.microsoft.com/office/word/2010/wordml" xmlns:w15="http://schemas.microsoft.com/office/word/2012/wordml" xmlns:w16cex="http://schemas.microsoft.com/office/word/2018/wordml/cex" xmlns:w16cid="http://schemas.microsoft.com/office/word/2016/wordml/cid" xmlns:w16="http://schemas.microsoft.com/office/word/2018/wordml" xmlns:w16du="http://schemas.microsoft.com/office/word/2023/wordml/word16du" xmlns:w16sdtdh="http://schemas.microsoft.com/office/word/2020/wordml/sdtdatahash" xmlns:w16sdtfl="http://schemas.microsoft.com/office/word/2024/wordml/sdtformatlock" xmlns:w16se="http://schemas.microsoft.com/office/word/2015/wordml/symex" xmlns:wpg="http://schemas.microsoft.com/office/word/2010/wordprocessingGroup" xmlns:wpi="http://schemas.microsoft.com/office/word/2010/wordprocessingInk" xmlns:wne="http://schemas.microsoft.com/office/word/2006/wordml" xmlns:wps="http://schemas.microsoft.com/office/word/2010/wordprocessingShape" mc:Ignorable="w14 w15 w16se w16cid w16 w16cex w16sdtdh w16sdtfl w16du wp14">
+  <w:footnote w:type="separator" w:id="-1">
+    <w:p>
+      <w:pPr>
+        <w:spacing w:after="0" w:line="240" w:lineRule="auto"/>
+      </w:pPr>
+      <w:r>
+        <w:separator/>
+      </w:r>
+    </w:p>
+  </w:footnote>
+  <w:footnote w:type="continuationSeparator" w:id="0">
+    <w:p>
+      <w:pPr>
+        <w:spacing w:after="0" w:line="240" w:lineRule="auto"/>
+      </w:pPr>
+      <w:r>
+        <w:continuationSeparator/>
+      </w:r>
+    </w:p>
+  </w:footnote>
+</w:footnotes>
+</file>
+
+<file path=word/header1.xml><?xml version="1.0" encoding="utf-8"?>
+<w:hdr xmlns:wpc="http://schemas.microsoft.com/office/word/2010/wordprocessingCanvas" xmlns:cx="http://schemas.microsoft.com/office/drawing/2014/chartex" xmlns:cx1="http://schemas.microsoft.com/office/drawing/2015/9/8/chartex" xmlns:cx2="http://schemas.microsoft.com/office/drawing/2015/10/21/chartex" xmlns:cx3="http://schemas.microsoft.com/office/drawing/2016/5/9/chartex" xmlns:cx4="http://schemas.microsoft.com/office/drawing/2016/5/10/chartex" xmlns:cx5="http://schemas.microsoft.com/office/drawing/2016/5/11/chartex" xmlns:cx6="http://schemas.microsoft.com/office/drawing/2016/5/12/chartex" xmlns:cx7="http://schemas.microsoft.com/office/drawing/2016/5/13/chartex" xmlns:cx8="http://schemas.microsoft.com/office/drawing/2016/5/14/chartex" xmlns:mc="http://schemas.openxmlformats.org/markup-compatibility/2006" xmlns:aink="http://schemas.microsoft.com/office/drawing/2016/ink" xmlns:am3d="http://schemas.microsoft.com/office/drawing/2017/model3d" xmlns:o="urn:schemas-microsoft-com:office:office" xmlns:oel="http://schemas.microsoft.com/office/2019/extlst" xmlns:r="http://schemas.openxmlformats.org/officeDocument/2006/relationships" xmlns:m="http://schemas.openxmlformats.org/officeDocument/2006/math" xmlns:v="urn:schemas-microsoft-com:vml" xmlns:wp14="http://schemas.microsoft.com/office/word/2010/wordprocessingDrawing" xmlns:wp="http://schemas.openxmlformats.org/drawingml/2006/wordprocessingDrawing" xmlns:w10="urn:schemas-microsoft-com:office:word" xmlns:w="http://schemas.openxmlformats.org/wordprocessingml/2006/main" xmlns:w14="http://schemas.microsoft.com/office/word/2010/wordml" xmlns:w15="http://schemas.microsoft.com/office/word/2012/wordml" xmlns:w16cex="http://schemas.microsoft.com/office/word/2018/wordml/cex" xmlns:w16cid="http://schemas.microsoft.com/office/word/2016/wordml/cid" xmlns:w16="http://schemas.microsoft.com/office/word/2018/wordml" xmlns:w16du="http://schemas.microsoft.com/office/word/2023/wordml/word16du" xmlns:w16sdtdh="http://schemas.microsoft.com/office/word/2020/wordml/sdtdatahash" xmlns:w16sdtfl="http://schemas.microsoft.com/office/word/2024/wordml/sdtformatlock" xmlns:w16se="http://schemas.microsoft.com/office/word/2015/wordml/symex" xmlns:wpg="http://schemas.microsoft.com/office/word/2010/wordprocessingGroup" xmlns:wpi="http://schemas.microsoft.com/office/word/2010/wordprocessingInk" xmlns:wne="http://schemas.microsoft.com/office/word/2006/wordml" xmlns:wps="http://schemas.microsoft.com/office/word/2010/wordprocessingShape" mc:Ignorable="w14 w15 w16se w16cid w16 w16cex w16sdtdh w16sdtfl w16du wp14">
+  <w:sdt>
+    <w:sdtPr>
+      <w:id w:val="2061744052"/>
+      <w:docPartObj>
+        <w:docPartGallery w:val="Page Numbers (Top of Page)"/>
+        <w:docPartUnique/>
+      </w:docPartObj>
+    </w:sdtPr>
+    <w:sdtEndPr>
+      <w:rPr>
+        <w:color w:val="7F7F7F" w:themeColor="background1" w:themeShade="7F"/>
+        <w:spacing w:val="60"/>
+      </w:rPr>
+    </w:sdtEndPr>
+    <w:sdtContent>
+      <w:p>
+        <w:pPr>
+          <w:pStyle w:val="Header"/>
+          <w:pBdr>
+            <w:bottom w:val="single" w:sz="4" w:space="1" w:color="D9D9D9" w:themeColor="background1" w:themeShade="D9"/>
+          </w:pBdr>
+          <w:rPr>
+            <w:b/>
+            <w:bCs/>
+            <w:lang w:val="fr-FR"/>
+          </w:rPr>
+        </w:pPr>
+        <w:r>
+          <w:fldChar w:fldCharType="begin"/>
+        </w:r>
+        <w:r>
+          <w:rPr>
+            <w:lang w:val="fr-FR"/>
+          </w:rPr>
+          <w:instrText xml:space="preserve"> PAGE   \* MERGEFORMAT </w:instrText>
+        </w:r>
+        <w:r>
+          <w:fldChar w:fldCharType="separate"/>
+        </w:r>
+        <w:r>
+          <w:rPr>
+            <w:b/>
+            <w:bCs/>
+            <w:noProof/>
+            <w:lang w:val="fr-FR"/>
+          </w:rPr>
+          <w:t>2</w:t>
+        </w:r>
+        <w:r>
+          <w:rPr>
+            <w:b/>
+            <w:bCs/>
+            <w:noProof/>
+          </w:rPr>
+          <w:fldChar w:fldCharType="end"/>
+        </w:r>
+        <w:r>
+          <w:rPr>
+            <w:b/>
+            <w:bCs/>
+            <w:lang w:val="fr-FR"/>
+          </w:rPr>
+          <w:t xml:space="preserve"> | </w:t>
+        </w:r>
+        <w:r>
+          <w:rPr>
+            <w:color w:val="7F7F7F" w:themeColor="background1" w:themeShade="7F"/>
+            <w:spacing w:val="60"/>
+            <w:lang w:val="fr-FR"/>
+          </w:rPr>
+          <w:t>Phase I Source Code Doc</w:t>
+        </w:r>
+        <w:r>
+          <w:rPr>
+            <w:color w:val="7F7F7F" w:themeColor="background1" w:themeShade="7F"/>
+            <w:spacing w:val="60"/>
+            <w:lang w:val="fr-FR"/>
+          </w:rPr>
+          <w:t>umentation</w:t>
+        </w:r>
+      </w:p>
+    </w:sdtContent>
+  </w:sdt>
+  <w:p>
+    <w:pPr>
+      <w:pStyle w:val="Header"/>
+      <w:rPr>
+        <w:lang w:val="fr-FR"/>
+      </w:rPr>
+    </w:pPr>
+  </w:p>
+</w:hdr>
 </file>
 
 <file path=word/numbering.xml><?xml version="1.0" encoding="utf-8"?>
@@ -5766,6 +6252,7 @@
   <w:style w:type="character" w:default="1" w:styleId="DefaultParagraphFont">
     <w:name w:val="Default Paragraph Font"/>
     <w:uiPriority w:val="1"/>
+    <w:semiHidden/>
     <w:unhideWhenUsed/>
   </w:style>
   <w:style w:type="table" w:default="1" w:styleId="TableNormal">

</xml_diff>

<commit_message>
Removed page headers I added as it took up unnecessary space.
</commit_message>
<xml_diff>
--- a/docs/Group3_Phase1_Source_Code_Report_Breakout.docx
+++ b/docs/Group3_Phase1_Source_Code_Report_Breakout.docx
@@ -1791,7 +1791,6 @@
           </w:tcPr>
           <w:p>
             <w:r>
-              <w:lastRenderedPageBreak/>
               <w:t>Menu / GUI screens</w:t>
             </w:r>
           </w:p>
@@ -1811,7 +1810,11 @@
           </w:tcPr>
           <w:p>
             <w:r>
-              <w:t>Optional in Phase I unless basic screen flow was completed early.</w:t>
+              <w:t xml:space="preserve">Optional in Phase I unless basic screen flow was </w:t>
+            </w:r>
+            <w:r>
+              <w:lastRenderedPageBreak/>
+              <w:t>completed early.</w:t>
             </w:r>
           </w:p>
         </w:tc>
@@ -1833,6 +1836,7 @@
               <w:jc w:val="center"/>
             </w:pPr>
             <w:r>
+              <w:lastRenderedPageBreak/>
               <w:t>[</w:t>
             </w:r>
             <w:r>
@@ -1858,7 +1862,11 @@
           </w:tcPr>
           <w:p>
             <w:r>
-              <w:t>Main menu and settings screen are implemented. Settings adjust paddle and ball speed multipliers. A fallback title-bar menu is used if no HUD font can be loaded.</w:t>
+              <w:t xml:space="preserve">Main menu and settings screen are implemented. Settings adjust paddle and </w:t>
+            </w:r>
+            <w:r>
+              <w:lastRenderedPageBreak/>
+              <w:t>ball speed multipliers. A fallback title-bar menu is used if no HUD font can be loaded.</w:t>
             </w:r>
           </w:p>
         </w:tc>
@@ -3035,8 +3043,11 @@
           </w:tcPr>
           <w:p>
             <w:r>
+              <w:t xml:space="preserve">Naming </w:t>
+            </w:r>
+            <w:r>
               <w:lastRenderedPageBreak/>
-              <w:t>Naming conventions</w:t>
+              <w:t>conventions</w:t>
             </w:r>
           </w:p>
         </w:tc>
@@ -3053,6 +3064,7 @@
           </w:tcPr>
           <w:p>
             <w:r>
+              <w:lastRenderedPageBreak/>
               <w:t xml:space="preserve">The codebase generally uses </w:t>
             </w:r>
             <w:proofErr w:type="spellStart"/>
@@ -3061,7 +3073,11 @@
             </w:r>
             <w:proofErr w:type="spellEnd"/>
             <w:r>
-              <w:t xml:space="preserve"> for classes and namespaces such as Game, </w:t>
+              <w:t xml:space="preserve"> for classes and namespaces such </w:t>
+            </w:r>
+            <w:r>
+              <w:lastRenderedPageBreak/>
+              <w:t>as Game, </w:t>
             </w:r>
             <w:proofErr w:type="spellStart"/>
             <w:r>
@@ -3099,6 +3115,7 @@
           </w:tcPr>
           <w:p>
             <w:r>
+              <w:lastRenderedPageBreak/>
               <w:t>Commenting approach</w:t>
             </w:r>
           </w:p>
@@ -3529,11 +3546,7 @@
           </w:tcPr>
           <w:p>
             <w:r>
-              <w:t xml:space="preserve">Move paddle continuously left and right and confirm it remains inside </w:t>
-            </w:r>
-            <w:r>
-              <w:lastRenderedPageBreak/>
-              <w:t>the play area.</w:t>
+              <w:t>Move paddle continuously left and right and confirm it remains inside the play area.</w:t>
             </w:r>
           </w:p>
         </w:tc>
@@ -3552,7 +3565,6 @@
               <w:jc w:val="center"/>
             </w:pPr>
             <w:r>
-              <w:lastRenderedPageBreak/>
               <w:t>[</w:t>
             </w:r>
             <w:r>
@@ -3578,11 +3590,7 @@
           </w:tcPr>
           <w:p>
             <w:r>
-              <w:t>Behavior is implemented in code and recorded as Pass in `docs/02_management/Phase1_Test</w:t>
-            </w:r>
-            <w:r>
-              <w:lastRenderedPageBreak/>
-              <w:t>_Checklist.md`.</w:t>
+              <w:t>Behavior is implemented in code and recorded as Pass in `docs/02_management/Phase1_Test_Checklist.md`.</w:t>
             </w:r>
           </w:p>
         </w:tc>
@@ -4167,7 +4175,6 @@
                 <w:b/>
                 <w:color w:val="FFFFFF"/>
               </w:rPr>
-              <w:lastRenderedPageBreak/>
               <w:t>Issue / Risk</w:t>
             </w:r>
           </w:p>
@@ -4238,7 +4245,11 @@
           </w:tcPr>
           <w:p>
             <w:r>
-              <w:t>Build environment inconsistency</w:t>
+              <w:t xml:space="preserve">Build environment </w:t>
+            </w:r>
+            <w:r>
+              <w:lastRenderedPageBreak/>
+              <w:t>inconsistency</w:t>
             </w:r>
           </w:p>
         </w:tc>
@@ -4255,7 +4266,12 @@
           </w:tcPr>
           <w:p>
             <w:r>
-              <w:t>Early build configuration depended on hardcoded machine-specific compiler and SFML paths, which created avoidable setup risk across developer environments.</w:t>
+              <w:lastRenderedPageBreak/>
+              <w:t xml:space="preserve">Early build configuration depended </w:t>
+            </w:r>
+            <w:r>
+              <w:lastRenderedPageBreak/>
+              <w:t>on hardcoded machine-specific compiler and SFML paths, which created avoidable setup risk across developer environments.</w:t>
             </w:r>
           </w:p>
         </w:tc>
@@ -4272,7 +4288,12 @@
           </w:tcPr>
           <w:p>
             <w:r>
-              <w:t xml:space="preserve">The team introduced a shared toolchain resolver, environment-variable override support, and a verified </w:t>
+              <w:lastRenderedPageBreak/>
+              <w:t xml:space="preserve">The team introduced a shared </w:t>
+            </w:r>
+            <w:r>
+              <w:lastRenderedPageBreak/>
+              <w:t xml:space="preserve">toolchain resolver, environment-variable override support, and a verified </w:t>
             </w:r>
             <w:proofErr w:type="spellStart"/>
             <w:r>
@@ -4302,6 +4323,7 @@
           </w:tcPr>
           <w:p>
             <w:r>
+              <w:lastRenderedPageBreak/>
               <w:t>Collision logic defects</w:t>
             </w:r>
           </w:p>
@@ -4699,17 +4721,17 @@
               <w:t xml:space="preserve">Created baseline SFML </w:t>
             </w:r>
             <w:r>
-              <w:t xml:space="preserve">application and implemented a prototype that </w:t>
+              <w:t>application and implemented a prototype that introduc</w:t>
+            </w:r>
+            <w:r>
+              <w:t xml:space="preserve">ed components to the </w:t>
+            </w:r>
+            <w:r>
+              <w:t xml:space="preserve">application such as paddle input </w:t>
             </w:r>
             <w:r>
               <w:lastRenderedPageBreak/>
-              <w:t>introduc</w:t>
-            </w:r>
-            <w:r>
-              <w:t xml:space="preserve">ed components to the </w:t>
-            </w:r>
-            <w:r>
-              <w:t>application such as paddle input and movement, ball velocity and wall/paddle collision handling</w:t>
+              <w:t>and movement, ball velocity and wall/paddle collision handling</w:t>
             </w:r>
             <w:r>
               <w:t>, and limited game state tracking.</w:t>
@@ -4966,7 +4988,6 @@
       </w:r>
       <w:proofErr w:type="spellStart"/>
       <w:r>
-        <w:lastRenderedPageBreak/>
         <w:t>CMake</w:t>
       </w:r>
       <w:proofErr w:type="spellEnd"/>
@@ -4983,7 +5004,6 @@
       </w:r>
     </w:p>
     <w:sectPr>
-      <w:headerReference w:type="default" r:id="rId9"/>
       <w:pgSz w:w="12240" w:h="15840"/>
       <w:pgMar w:top="1008" w:right="1152" w:bottom="1008" w:left="1152" w:header="720" w:footer="720" w:gutter="0"/>
       <w:cols w:space="720"/>
@@ -5041,102 +5061,6 @@
     </w:p>
   </w:footnote>
 </w:footnotes>
-</file>
-
-<file path=word/header1.xml><?xml version="1.0" encoding="utf-8"?>
-<w:hdr xmlns:wpc="http://schemas.microsoft.com/office/word/2010/wordprocessingCanvas" xmlns:cx="http://schemas.microsoft.com/office/drawing/2014/chartex" xmlns:cx1="http://schemas.microsoft.com/office/drawing/2015/9/8/chartex" xmlns:cx2="http://schemas.microsoft.com/office/drawing/2015/10/21/chartex" xmlns:cx3="http://schemas.microsoft.com/office/drawing/2016/5/9/chartex" xmlns:cx4="http://schemas.microsoft.com/office/drawing/2016/5/10/chartex" xmlns:cx5="http://schemas.microsoft.com/office/drawing/2016/5/11/chartex" xmlns:cx6="http://schemas.microsoft.com/office/drawing/2016/5/12/chartex" xmlns:cx7="http://schemas.microsoft.com/office/drawing/2016/5/13/chartex" xmlns:cx8="http://schemas.microsoft.com/office/drawing/2016/5/14/chartex" xmlns:mc="http://schemas.openxmlformats.org/markup-compatibility/2006" xmlns:aink="http://schemas.microsoft.com/office/drawing/2016/ink" xmlns:am3d="http://schemas.microsoft.com/office/drawing/2017/model3d" xmlns:o="urn:schemas-microsoft-com:office:office" xmlns:oel="http://schemas.microsoft.com/office/2019/extlst" xmlns:r="http://schemas.openxmlformats.org/officeDocument/2006/relationships" xmlns:m="http://schemas.openxmlformats.org/officeDocument/2006/math" xmlns:v="urn:schemas-microsoft-com:vml" xmlns:wp14="http://schemas.microsoft.com/office/word/2010/wordprocessingDrawing" xmlns:wp="http://schemas.openxmlformats.org/drawingml/2006/wordprocessingDrawing" xmlns:w10="urn:schemas-microsoft-com:office:word" xmlns:w="http://schemas.openxmlformats.org/wordprocessingml/2006/main" xmlns:w14="http://schemas.microsoft.com/office/word/2010/wordml" xmlns:w15="http://schemas.microsoft.com/office/word/2012/wordml" xmlns:w16cex="http://schemas.microsoft.com/office/word/2018/wordml/cex" xmlns:w16cid="http://schemas.microsoft.com/office/word/2016/wordml/cid" xmlns:w16="http://schemas.microsoft.com/office/word/2018/wordml" xmlns:w16du="http://schemas.microsoft.com/office/word/2023/wordml/word16du" xmlns:w16sdtdh="http://schemas.microsoft.com/office/word/2020/wordml/sdtdatahash" xmlns:w16sdtfl="http://schemas.microsoft.com/office/word/2024/wordml/sdtformatlock" xmlns:w16se="http://schemas.microsoft.com/office/word/2015/wordml/symex" xmlns:wpg="http://schemas.microsoft.com/office/word/2010/wordprocessingGroup" xmlns:wpi="http://schemas.microsoft.com/office/word/2010/wordprocessingInk" xmlns:wne="http://schemas.microsoft.com/office/word/2006/wordml" xmlns:wps="http://schemas.microsoft.com/office/word/2010/wordprocessingShape" mc:Ignorable="w14 w15 w16se w16cid w16 w16cex w16sdtdh w16sdtfl w16du wp14">
-  <w:sdt>
-    <w:sdtPr>
-      <w:id w:val="2061744052"/>
-      <w:docPartObj>
-        <w:docPartGallery w:val="Page Numbers (Top of Page)"/>
-        <w:docPartUnique/>
-      </w:docPartObj>
-    </w:sdtPr>
-    <w:sdtEndPr>
-      <w:rPr>
-        <w:color w:val="7F7F7F" w:themeColor="background1" w:themeShade="7F"/>
-        <w:spacing w:val="60"/>
-      </w:rPr>
-    </w:sdtEndPr>
-    <w:sdtContent>
-      <w:p>
-        <w:pPr>
-          <w:pStyle w:val="Header"/>
-          <w:pBdr>
-            <w:bottom w:val="single" w:sz="4" w:space="1" w:color="D9D9D9" w:themeColor="background1" w:themeShade="D9"/>
-          </w:pBdr>
-          <w:rPr>
-            <w:b/>
-            <w:bCs/>
-            <w:lang w:val="fr-FR"/>
-          </w:rPr>
-        </w:pPr>
-        <w:r>
-          <w:fldChar w:fldCharType="begin"/>
-        </w:r>
-        <w:r>
-          <w:rPr>
-            <w:lang w:val="fr-FR"/>
-          </w:rPr>
-          <w:instrText xml:space="preserve"> PAGE   \* MERGEFORMAT </w:instrText>
-        </w:r>
-        <w:r>
-          <w:fldChar w:fldCharType="separate"/>
-        </w:r>
-        <w:r>
-          <w:rPr>
-            <w:b/>
-            <w:bCs/>
-            <w:noProof/>
-            <w:lang w:val="fr-FR"/>
-          </w:rPr>
-          <w:t>2</w:t>
-        </w:r>
-        <w:r>
-          <w:rPr>
-            <w:b/>
-            <w:bCs/>
-            <w:noProof/>
-          </w:rPr>
-          <w:fldChar w:fldCharType="end"/>
-        </w:r>
-        <w:r>
-          <w:rPr>
-            <w:b/>
-            <w:bCs/>
-            <w:lang w:val="fr-FR"/>
-          </w:rPr>
-          <w:t xml:space="preserve"> | </w:t>
-        </w:r>
-        <w:r>
-          <w:rPr>
-            <w:color w:val="7F7F7F" w:themeColor="background1" w:themeShade="7F"/>
-            <w:spacing w:val="60"/>
-            <w:lang w:val="fr-FR"/>
-          </w:rPr>
-          <w:t>Phase I Source Code Doc</w:t>
-        </w:r>
-        <w:r>
-          <w:rPr>
-            <w:color w:val="7F7F7F" w:themeColor="background1" w:themeShade="7F"/>
-            <w:spacing w:val="60"/>
-            <w:lang w:val="fr-FR"/>
-          </w:rPr>
-          <w:t>umentation</w:t>
-        </w:r>
-      </w:p>
-    </w:sdtContent>
-  </w:sdt>
-  <w:p>
-    <w:pPr>
-      <w:pStyle w:val="Header"/>
-      <w:rPr>
-        <w:lang w:val="fr-FR"/>
-      </w:rPr>
-    </w:pPr>
-  </w:p>
-</w:hdr>
 </file>
 
 <file path=word/numbering.xml><?xml version="1.0" encoding="utf-8"?>

</xml_diff>

<commit_message>
Added Francini's Contributions. Combined and deleted Kenise's other version of document.
</commit_message>
<xml_diff>
--- a/docs/Group3_Phase1_Source_Code_Report_Breakout.docx
+++ b/docs/Group3_Phase1_Source_Code_Report_Breakout.docx
@@ -82,8 +82,6 @@
       </w:r>
       <w:r>
         <w:br/>
-      </w:r>
-      <w:r>
         <w:t>Project Context: Built from the approved Project Plan and Theory/Design documents</w:t>
       </w:r>
       <w:r>
@@ -837,10 +835,7 @@
     </w:p>
     <w:p>
       <w:r>
-        <w:t xml:space="preserve">Supporting modules keep a few responsibilities separated. GameConstants.h stores tunable values for the window, paddle, ball, and brick layout. GameHelpers.h contains small pure helper functions for paddle clamping, life decrement protection, and remaining-brick checks. src/PhysicsManager.h stores ball velocity and reflection helpers. src/GameManager.h and src/GameManager.cpp manage life state and game-state tracking. This architecture is intentionally lightweight for Phase I and supports later refactoring </w:t>
-      </w:r>
-      <w:r>
-        <w:t>into more granular modules.</w:t>
+        <w:t>Supporting modules keep a few responsibilities separated. GameConstants.h stores tunable values for the window, paddle, ball, and brick layout. GameHelpers.h contains small pure helper functions for paddle clamping, life decrement protection, and remaining-brick checks. src/PhysicsManager.h stores ball velocity and reflection helpers. src/GameManager.h and src/GameManager.cpp manage life state and game-state tracking. This architecture is intentionally lightweight for Phase I and supports later refactoring into more granular modules.</w:t>
       </w:r>
     </w:p>
     <w:p>
@@ -4332,7 +4327,19 @@
           </w:tcPr>
           <w:p>
             <w:r>
-              <w:t>[Insert completed work]</w:t>
+              <w:t xml:space="preserve">N/A unable to properly contribute due to </w:t>
+            </w:r>
+            <w:r>
+              <w:t>G</w:t>
+            </w:r>
+            <w:r>
+              <w:t>i</w:t>
+            </w:r>
+            <w:r>
+              <w:t>t H</w:t>
+            </w:r>
+            <w:r>
+              <w:t>ub cloning error.</w:t>
             </w:r>
           </w:p>
         </w:tc>
@@ -4446,10 +4453,7 @@
     </w:p>
     <w:p>
       <w:r>
-        <w:t>The remaining technical priorities are broader automated gameplay coverage, collision refinement, and modular cleanup rather than missing core gameplay code; manual gameplay evidence is now recorded in `docs/02_management/Phase1_Test_Checklist.md`. The manual Phase I test checklist has been completed and recorded, and the report now reflects the active Phase I code path; remaining process improvements are primarily around evidence-log maintenance and broader automated gameplay coverage. From a development s</w:t>
-      </w:r>
-      <w:r>
-        <w:t xml:space="preserve">tandpoint, the project is ready to move into the next phase with future work focused on testing maturity, collision refinement, modular cleanup, and additional polish rather than first-time implementation of the core game systems. The repository now includes both a verified </w:t>
+        <w:t xml:space="preserve">The remaining technical priorities are broader automated gameplay coverage, collision refinement, and modular cleanup rather than missing core gameplay code; manual gameplay evidence is now recorded in `docs/02_management/Phase1_Test_Checklist.md`. The manual Phase I test checklist has been completed and recorded, and the report now reflects the active Phase I code path; remaining process improvements are primarily around evidence-log maintenance and broader automated gameplay coverage. From a development standpoint, the project is ready to move into the next phase with future work focused on testing maturity, collision refinement, modular cleanup, and additional polish rather than first-time implementation of the core game systems. The repository now includes both a verified </w:t>
       </w:r>
       <w:proofErr w:type="spellStart"/>
       <w:r>
@@ -5008,7 +5012,6 @@
   <w:style w:type="character" w:default="1" w:styleId="DefaultParagraphFont">
     <w:name w:val="Default Paragraph Font"/>
     <w:uiPriority w:val="1"/>
-    <w:semiHidden/>
     <w:unhideWhenUsed/>
   </w:style>
   <w:style w:type="table" w:default="1" w:styleId="TableNormal">

</xml_diff>